<commit_message>
Fix: update geodesy template to proper empty template
Replace filled report with proper empty template for geodesy control.
Ensures reports are correctly appended to template during merge.

Co-Authored-By: Claude Haiku 4.5 <noreply@anthropic.com>
</commit_message>
<xml_diff>
--- a/contractor_report/болванки (шаблоны не вырезать только копировать)/Геодезический контроль_Ежедневный отчёт СК за 02.08.2025г.docx
+++ b/contractor_report/болванки (шаблоны не вырезать только копировать)/Геодезический контроль_Ежедневный отчёт СК за 02.08.2025г.docx
@@ -1,3826 +1,7 @@
 
 <file path=word/document.xml><?xml version="1.0" encoding="utf-8"?>
-<w:document xmlns:wpc="http://schemas.microsoft.com/office/word/2010/wordprocessingCanvas" xmlns:cx="http://schemas.microsoft.com/office/drawing/2014/chartex" xmlns:cx1="http://schemas.microsoft.com/office/drawing/2015/9/8/chartex" xmlns:mc="http://schemas.openxmlformats.org/markup-compatibility/2006" xmlns:o="urn:schemas-microsoft-com:office:office" xmlns:r="http://schemas.openxmlformats.org/officeDocument/2006/relationships" xmlns:m="http://schemas.openxmlformats.org/officeDocument/2006/math" xmlns:v="urn:schemas-microsoft-com:vml" xmlns:wp14="http://schemas.microsoft.com/office/word/2010/wordprocessingDrawing" xmlns:wp="http://schemas.openxmlformats.org/drawingml/2006/wordprocessingDrawing" xmlns:w10="urn:schemas-microsoft-com:office:word" xmlns:w="http://schemas.openxmlformats.org/wordprocessingml/2006/main" xmlns:w14="http://schemas.microsoft.com/office/word/2010/wordml" xmlns:w15="http://schemas.microsoft.com/office/word/2012/wordml" xmlns:w16se="http://schemas.microsoft.com/office/word/2015/wordml/symex" xmlns:wpg="http://schemas.microsoft.com/office/word/2010/wordprocessingGroup" xmlns:wpi="http://schemas.microsoft.com/office/word/2010/wordprocessingInk" xmlns:wne="http://schemas.microsoft.com/office/word/2006/wordml" xmlns:wps="http://schemas.microsoft.com/office/word/2010/wordprocessingShape" mc:Ignorable="w14 w15 w16se wp14">
+<w:document xmlns:wpc="http://schemas.microsoft.com/office/word/2010/wordprocessingCanvas" xmlns:cx="http://schemas.microsoft.com/office/drawing/2014/chartex" xmlns:cx1="http://schemas.microsoft.com/office/drawing/2015/9/8/chartex" xmlns:cx2="http://schemas.microsoft.com/office/drawing/2015/10/21/chartex" xmlns:cx3="http://schemas.microsoft.com/office/drawing/2016/5/9/chartex" xmlns:cx4="http://schemas.microsoft.com/office/drawing/2016/5/10/chartex" xmlns:cx5="http://schemas.microsoft.com/office/drawing/2016/5/11/chartex" xmlns:cx6="http://schemas.microsoft.com/office/drawing/2016/5/12/chartex" xmlns:cx7="http://schemas.microsoft.com/office/drawing/2016/5/13/chartex" xmlns:cx8="http://schemas.microsoft.com/office/drawing/2016/5/14/chartex" xmlns:mc="http://schemas.openxmlformats.org/markup-compatibility/2006" xmlns:aink="http://schemas.microsoft.com/office/drawing/2016/ink" xmlns:am3d="http://schemas.microsoft.com/office/drawing/2017/model3d" xmlns:o="urn:schemas-microsoft-com:office:office" xmlns:r="http://schemas.openxmlformats.org/officeDocument/2006/relationships" xmlns:m="http://schemas.openxmlformats.org/officeDocument/2006/math" xmlns:v="urn:schemas-microsoft-com:vml" xmlns:wp14="http://schemas.microsoft.com/office/word/2010/wordprocessingDrawing" xmlns:wp="http://schemas.openxmlformats.org/drawingml/2006/wordprocessingDrawing" xmlns:w10="urn:schemas-microsoft-com:office:word" xmlns:w="http://schemas.openxmlformats.org/wordprocessingml/2006/main" xmlns:w14="http://schemas.microsoft.com/office/word/2010/wordml" xmlns:w15="http://schemas.microsoft.com/office/word/2012/wordml" xmlns:w16cex="http://schemas.microsoft.com/office/word/2018/wordml/cex" xmlns:w16cid="http://schemas.microsoft.com/office/word/2016/wordml/cid" xmlns:w16="http://schemas.microsoft.com/office/word/2018/wordml" xmlns:w16se="http://schemas.microsoft.com/office/word/2015/wordml/symex" xmlns:wpg="http://schemas.microsoft.com/office/word/2010/wordprocessingGroup" xmlns:wpi="http://schemas.microsoft.com/office/word/2010/wordprocessingInk" xmlns:wne="http://schemas.microsoft.com/office/word/2006/wordml" xmlns:wps="http://schemas.microsoft.com/office/word/2010/wordprocessingShape" mc:Ignorable="w14 w15 w16se w16cid w16 w16cex wp14">
   <w:body>
-    <w:tbl>
-      <w:tblPr>
-        <w:tblStyle w:val="ab"/>
-        <w:tblW w:w="10421" w:type="dxa"/>
-        <w:tblBorders>
-          <w:top w:val="threeDEmboss" w:sz="12" w:space="0" w:color="auto"/>
-          <w:left w:val="threeDEmboss" w:sz="12" w:space="0" w:color="auto"/>
-          <w:bottom w:val="threeDEmboss" w:sz="12" w:space="0" w:color="auto"/>
-          <w:right w:val="threeDEmboss" w:sz="12" w:space="0" w:color="auto"/>
-          <w:insideH w:val="threeDEmboss" w:sz="12" w:space="0" w:color="auto"/>
-          <w:insideV w:val="threeDEmboss" w:sz="12" w:space="0" w:color="auto"/>
-        </w:tblBorders>
-        <w:tblLayout w:type="fixed"/>
-        <w:tblLook w:val="04A0" w:firstRow="1" w:lastRow="0" w:firstColumn="1" w:lastColumn="0" w:noHBand="0" w:noVBand="1"/>
-      </w:tblPr>
-      <w:tblGrid>
-        <w:gridCol w:w="1731"/>
-        <w:gridCol w:w="1849"/>
-        <w:gridCol w:w="1875"/>
-        <w:gridCol w:w="1735"/>
-        <w:gridCol w:w="1534"/>
-        <w:gridCol w:w="1697"/>
-      </w:tblGrid>
-      <w:tr>
-        <w:trPr>
-          <w:trHeight w:val="474"/>
-        </w:trPr>
-        <w:tc>
-          <w:tcPr>
-            <w:tcW w:w="5455" w:type="dxa"/>
-            <w:gridSpan w:val="3"/>
-            <w:vAlign w:val="center"/>
-            <w:hideMark/>
-          </w:tcPr>
-          <w:p>
-            <w:pPr>
-              <w:jc w:val="center"/>
-              <w:rPr>
-                <w:rFonts w:ascii="Times New Roman" w:hAnsi="Times New Roman" w:cs="Times New Roman"/>
-                <w:b/>
-                <w:bCs/>
-                <w:sz w:val="20"/>
-                <w:szCs w:val="20"/>
-              </w:rPr>
-            </w:pPr>
-            <w:r>
-              <w:rPr>
-                <w:rFonts w:ascii="Times New Roman" w:hAnsi="Times New Roman" w:cs="Times New Roman"/>
-                <w:b/>
-                <w:bCs/>
-                <w:sz w:val="20"/>
-                <w:szCs w:val="20"/>
-              </w:rPr>
-              <w:t>Ежедневный индивидуальный отчёт</w:t>
-            </w:r>
-            <w:r>
-              <w:rPr>
-                <w:rFonts w:ascii="Times New Roman" w:hAnsi="Times New Roman" w:cs="Times New Roman"/>
-                <w:b/>
-                <w:bCs/>
-                <w:sz w:val="20"/>
-                <w:szCs w:val="20"/>
-              </w:rPr>
-              <w:br/>
-              <w:t>по строительному контролю</w:t>
-            </w:r>
-          </w:p>
-        </w:tc>
-        <w:tc>
-          <w:tcPr>
-            <w:tcW w:w="1735" w:type="dxa"/>
-            <w:noWrap/>
-            <w:vAlign w:val="center"/>
-            <w:hideMark/>
-          </w:tcPr>
-          <w:p>
-            <w:pPr>
-              <w:jc w:val="center"/>
-              <w:rPr>
-                <w:rFonts w:ascii="Times New Roman" w:hAnsi="Times New Roman" w:cs="Times New Roman"/>
-                <w:b/>
-                <w:sz w:val="20"/>
-                <w:szCs w:val="20"/>
-              </w:rPr>
-            </w:pPr>
-            <w:r>
-              <w:rPr>
-                <w:rFonts w:ascii="Times New Roman" w:hAnsi="Times New Roman" w:cs="Times New Roman"/>
-                <w:b/>
-                <w:sz w:val="20"/>
-                <w:szCs w:val="20"/>
-              </w:rPr>
-              <w:t>Страница</w:t>
-            </w:r>
-          </w:p>
-        </w:tc>
-        <w:tc>
-          <w:tcPr>
-            <w:tcW w:w="1534" w:type="dxa"/>
-            <w:noWrap/>
-            <w:vAlign w:val="center"/>
-            <w:hideMark/>
-          </w:tcPr>
-          <w:p>
-            <w:pPr>
-              <w:jc w:val="center"/>
-              <w:rPr>
-                <w:rFonts w:ascii="Times New Roman" w:hAnsi="Times New Roman" w:cs="Times New Roman"/>
-                <w:bCs/>
-                <w:sz w:val="20"/>
-                <w:szCs w:val="20"/>
-              </w:rPr>
-            </w:pPr>
-            <w:r>
-              <w:rPr>
-                <w:rFonts w:ascii="Times New Roman" w:hAnsi="Times New Roman" w:cs="Times New Roman"/>
-                <w:bCs/>
-                <w:sz w:val="20"/>
-                <w:szCs w:val="20"/>
-              </w:rPr>
-              <w:t>1</w:t>
-            </w:r>
-          </w:p>
-        </w:tc>
-        <w:tc>
-          <w:tcPr>
-            <w:tcW w:w="1697" w:type="dxa"/>
-            <w:noWrap/>
-            <w:vAlign w:val="center"/>
-            <w:hideMark/>
-          </w:tcPr>
-          <w:p>
-            <w:pPr>
-              <w:jc w:val="center"/>
-              <w:rPr>
-                <w:rFonts w:ascii="Times New Roman" w:hAnsi="Times New Roman" w:cs="Times New Roman"/>
-                <w:bCs/>
-                <w:sz w:val="20"/>
-                <w:szCs w:val="20"/>
-              </w:rPr>
-            </w:pPr>
-            <w:r>
-              <w:rPr>
-                <w:rFonts w:ascii="Times New Roman" w:hAnsi="Times New Roman" w:cs="Times New Roman"/>
-                <w:bCs/>
-                <w:sz w:val="20"/>
-                <w:szCs w:val="20"/>
-              </w:rPr>
-              <w:t>2</w:t>
-            </w:r>
-          </w:p>
-        </w:tc>
-      </w:tr>
-      <w:tr>
-        <w:trPr>
-          <w:trHeight w:val="750"/>
-        </w:trPr>
-        <w:tc>
-          <w:tcPr>
-            <w:tcW w:w="1731" w:type="dxa"/>
-            <w:shd w:val="clear" w:color="auto" w:fill="C6D9F1" w:themeFill="text2" w:themeFillTint="33"/>
-            <w:noWrap/>
-            <w:vAlign w:val="center"/>
-            <w:hideMark/>
-          </w:tcPr>
-          <w:p>
-            <w:pPr>
-              <w:jc w:val="center"/>
-              <w:rPr>
-                <w:rFonts w:ascii="Times New Roman" w:hAnsi="Times New Roman" w:cs="Times New Roman"/>
-                <w:b/>
-                <w:sz w:val="20"/>
-                <w:szCs w:val="20"/>
-              </w:rPr>
-            </w:pPr>
-            <w:r>
-              <w:rPr>
-                <w:rFonts w:ascii="Times New Roman" w:hAnsi="Times New Roman" w:cs="Times New Roman"/>
-                <w:b/>
-                <w:sz w:val="20"/>
-                <w:szCs w:val="20"/>
-              </w:rPr>
-              <w:t>Отчет №</w:t>
-            </w:r>
-          </w:p>
-        </w:tc>
-        <w:tc>
-          <w:tcPr>
-            <w:tcW w:w="1849" w:type="dxa"/>
-            <w:shd w:val="clear" w:color="auto" w:fill="C6D9F1" w:themeFill="text2" w:themeFillTint="33"/>
-            <w:vAlign w:val="center"/>
-            <w:hideMark/>
-          </w:tcPr>
-          <w:p>
-            <w:pPr>
-              <w:jc w:val="center"/>
-              <w:rPr>
-                <w:rFonts w:ascii="Times New Roman" w:hAnsi="Times New Roman" w:cs="Times New Roman"/>
-                <w:bCs/>
-                <w:sz w:val="20"/>
-                <w:szCs w:val="20"/>
-                <w:highlight w:val="yellow"/>
-              </w:rPr>
-            </w:pPr>
-            <w:r>
-              <w:rPr>
-                <w:rFonts w:ascii="Times New Roman" w:hAnsi="Times New Roman" w:cs="Times New Roman"/>
-                <w:bCs/>
-                <w:sz w:val="20"/>
-                <w:szCs w:val="20"/>
-              </w:rPr>
-              <w:t>б/н</w:t>
-            </w:r>
-          </w:p>
-        </w:tc>
-        <w:tc>
-          <w:tcPr>
-            <w:tcW w:w="1875" w:type="dxa"/>
-            <w:shd w:val="clear" w:color="auto" w:fill="C6D9F1" w:themeFill="text2" w:themeFillTint="33"/>
-            <w:noWrap/>
-            <w:vAlign w:val="center"/>
-            <w:hideMark/>
-          </w:tcPr>
-          <w:p>
-            <w:pPr>
-              <w:jc w:val="center"/>
-              <w:rPr>
-                <w:rFonts w:ascii="Times New Roman" w:hAnsi="Times New Roman" w:cs="Times New Roman"/>
-                <w:b/>
-                <w:sz w:val="20"/>
-                <w:szCs w:val="20"/>
-              </w:rPr>
-            </w:pPr>
-            <w:r>
-              <w:rPr>
-                <w:rFonts w:ascii="Times New Roman" w:hAnsi="Times New Roman" w:cs="Times New Roman"/>
-                <w:b/>
-                <w:sz w:val="20"/>
-                <w:szCs w:val="20"/>
-              </w:rPr>
-              <w:t>Объект</w:t>
-            </w:r>
-          </w:p>
-        </w:tc>
-        <w:tc>
-          <w:tcPr>
-            <w:tcW w:w="4966" w:type="dxa"/>
-            <w:gridSpan w:val="3"/>
-            <w:shd w:val="clear" w:color="auto" w:fill="C6D9F1" w:themeFill="text2" w:themeFillTint="33"/>
-            <w:noWrap/>
-            <w:vAlign w:val="center"/>
-            <w:hideMark/>
-          </w:tcPr>
-          <w:p>
-            <w:pPr>
-              <w:jc w:val="center"/>
-              <w:rPr>
-                <w:rFonts w:ascii="Times New Roman" w:hAnsi="Times New Roman" w:cs="Times New Roman"/>
-                <w:b/>
-                <w:bCs/>
-                <w:sz w:val="20"/>
-                <w:szCs w:val="20"/>
-              </w:rPr>
-            </w:pPr>
-            <w:r>
-              <w:rPr>
-                <w:rFonts w:ascii="Times New Roman" w:hAnsi="Times New Roman" w:cs="Times New Roman"/>
-                <w:b/>
-                <w:bCs/>
-                <w:sz w:val="20"/>
-                <w:szCs w:val="20"/>
-              </w:rPr>
-              <w:t>1-ый пусковой комплекс куста скважин №1. Реконструкция.</w:t>
-            </w:r>
-          </w:p>
-        </w:tc>
-      </w:tr>
-      <w:tr>
-        <w:trPr>
-          <w:trHeight w:val="750"/>
-        </w:trPr>
-        <w:tc>
-          <w:tcPr>
-            <w:tcW w:w="1731" w:type="dxa"/>
-            <w:noWrap/>
-            <w:vAlign w:val="center"/>
-            <w:hideMark/>
-          </w:tcPr>
-          <w:p>
-            <w:pPr>
-              <w:jc w:val="center"/>
-              <w:rPr>
-                <w:rFonts w:ascii="Times New Roman" w:hAnsi="Times New Roman" w:cs="Times New Roman"/>
-                <w:b/>
-                <w:sz w:val="20"/>
-                <w:szCs w:val="20"/>
-              </w:rPr>
-            </w:pPr>
-            <w:r>
-              <w:rPr>
-                <w:rFonts w:ascii="Times New Roman" w:hAnsi="Times New Roman" w:cs="Times New Roman"/>
-                <w:b/>
-                <w:sz w:val="20"/>
-                <w:szCs w:val="20"/>
-              </w:rPr>
-              <w:t>Дата</w:t>
-            </w:r>
-          </w:p>
-        </w:tc>
-        <w:tc>
-          <w:tcPr>
-            <w:tcW w:w="1849" w:type="dxa"/>
-            <w:vAlign w:val="center"/>
-            <w:hideMark/>
-          </w:tcPr>
-          <w:p>
-            <w:pPr>
-              <w:jc w:val="center"/>
-              <w:rPr>
-                <w:rFonts w:ascii="Times New Roman" w:hAnsi="Times New Roman" w:cs="Times New Roman"/>
-                <w:bCs/>
-                <w:sz w:val="20"/>
-                <w:szCs w:val="20"/>
-                <w:highlight w:val="yellow"/>
-              </w:rPr>
-            </w:pPr>
-            <w:r>
-              <w:rPr>
-                <w:rFonts w:ascii="Times New Roman" w:hAnsi="Times New Roman" w:cs="Times New Roman"/>
-                <w:bCs/>
-                <w:sz w:val="20"/>
-                <w:szCs w:val="20"/>
-              </w:rPr>
-              <w:t>2</w:t>
-            </w:r>
-            <w:r>
-              <w:rPr>
-                <w:rFonts w:ascii="Times New Roman" w:hAnsi="Times New Roman" w:cs="Times New Roman"/>
-                <w:bCs/>
-                <w:sz w:val="20"/>
-                <w:szCs w:val="20"/>
-              </w:rPr>
-              <w:t>6</w:t>
-            </w:r>
-            <w:r>
-              <w:rPr>
-                <w:rFonts w:ascii="Times New Roman" w:hAnsi="Times New Roman" w:cs="Times New Roman"/>
-                <w:bCs/>
-                <w:sz w:val="20"/>
-                <w:szCs w:val="20"/>
-                <w:lang w:val="en-US"/>
-              </w:rPr>
-              <w:t>.</w:t>
-            </w:r>
-            <w:r>
-              <w:rPr>
-                <w:rFonts w:ascii="Times New Roman" w:hAnsi="Times New Roman" w:cs="Times New Roman"/>
-                <w:bCs/>
-                <w:sz w:val="20"/>
-                <w:szCs w:val="20"/>
-              </w:rPr>
-              <w:t>0</w:t>
-            </w:r>
-            <w:r>
-              <w:rPr>
-                <w:rFonts w:ascii="Times New Roman" w:hAnsi="Times New Roman" w:cs="Times New Roman"/>
-                <w:bCs/>
-                <w:sz w:val="20"/>
-                <w:szCs w:val="20"/>
-              </w:rPr>
-              <w:t>4</w:t>
-            </w:r>
-            <w:r>
-              <w:rPr>
-                <w:rFonts w:ascii="Times New Roman" w:hAnsi="Times New Roman" w:cs="Times New Roman"/>
-                <w:bCs/>
-                <w:sz w:val="20"/>
-                <w:szCs w:val="20"/>
-              </w:rPr>
-              <w:t>.2</w:t>
-            </w:r>
-            <w:r>
-              <w:rPr>
-                <w:rFonts w:ascii="Times New Roman" w:hAnsi="Times New Roman" w:cs="Times New Roman"/>
-                <w:bCs/>
-                <w:sz w:val="20"/>
-                <w:szCs w:val="20"/>
-              </w:rPr>
-              <w:t>6</w:t>
-            </w:r>
-          </w:p>
-        </w:tc>
-        <w:tc>
-          <w:tcPr>
-            <w:tcW w:w="1875" w:type="dxa"/>
-            <w:vAlign w:val="center"/>
-            <w:hideMark/>
-          </w:tcPr>
-          <w:p>
-            <w:pPr>
-              <w:jc w:val="center"/>
-              <w:rPr>
-                <w:rFonts w:ascii="Times New Roman" w:hAnsi="Times New Roman" w:cs="Times New Roman"/>
-                <w:b/>
-                <w:sz w:val="20"/>
-                <w:szCs w:val="20"/>
-              </w:rPr>
-            </w:pPr>
-            <w:r>
-              <w:rPr>
-                <w:rFonts w:ascii="Times New Roman" w:hAnsi="Times New Roman" w:cs="Times New Roman"/>
-                <w:b/>
-                <w:sz w:val="20"/>
-                <w:szCs w:val="20"/>
-              </w:rPr>
-              <w:t>Направление контроля</w:t>
-            </w:r>
-          </w:p>
-        </w:tc>
-        <w:tc>
-          <w:tcPr>
-            <w:tcW w:w="4966" w:type="dxa"/>
-            <w:gridSpan w:val="3"/>
-            <w:noWrap/>
-            <w:vAlign w:val="center"/>
-            <w:hideMark/>
-          </w:tcPr>
-          <w:p>
-            <w:pPr>
-              <w:jc w:val="center"/>
-              <w:rPr>
-                <w:rFonts w:ascii="Times New Roman" w:hAnsi="Times New Roman" w:cs="Times New Roman"/>
-                <w:sz w:val="20"/>
-                <w:szCs w:val="20"/>
-              </w:rPr>
-            </w:pPr>
-            <w:r>
-              <w:rPr>
-                <w:rFonts w:ascii="Times New Roman" w:hAnsi="Times New Roman" w:cs="Times New Roman"/>
-                <w:sz w:val="20"/>
-                <w:szCs w:val="20"/>
-              </w:rPr>
-              <w:t>Геодезический контроль</w:t>
-            </w:r>
-          </w:p>
-        </w:tc>
-      </w:tr>
-      <w:tr>
-        <w:trPr>
-          <w:trHeight w:val="353"/>
-        </w:trPr>
-        <w:tc>
-          <w:tcPr>
-            <w:tcW w:w="7190" w:type="dxa"/>
-            <w:gridSpan w:val="4"/>
-            <w:vAlign w:val="center"/>
-            <w:hideMark/>
-          </w:tcPr>
-          <w:p>
-            <w:pPr>
-              <w:jc w:val="center"/>
-              <w:rPr>
-                <w:rFonts w:ascii="Times New Roman" w:hAnsi="Times New Roman" w:cs="Times New Roman"/>
-                <w:b/>
-                <w:bCs/>
-                <w:sz w:val="20"/>
-                <w:szCs w:val="20"/>
-              </w:rPr>
-            </w:pPr>
-            <w:r>
-              <w:rPr>
-                <w:rFonts w:ascii="Times New Roman" w:hAnsi="Times New Roman" w:cs="Times New Roman"/>
-                <w:b/>
-                <w:bCs/>
-                <w:sz w:val="20"/>
-                <w:szCs w:val="20"/>
-              </w:rPr>
-              <w:t>ДАННЫЕ ЗАКАЗЧИКА</w:t>
-            </w:r>
-          </w:p>
-        </w:tc>
-        <w:tc>
-          <w:tcPr>
-            <w:tcW w:w="3231" w:type="dxa"/>
-            <w:gridSpan w:val="2"/>
-            <w:vAlign w:val="center"/>
-            <w:hideMark/>
-          </w:tcPr>
-          <w:p>
-            <w:pPr>
-              <w:jc w:val="center"/>
-              <w:rPr>
-                <w:rFonts w:ascii="Times New Roman" w:hAnsi="Times New Roman" w:cs="Times New Roman"/>
-                <w:b/>
-                <w:sz w:val="20"/>
-                <w:szCs w:val="20"/>
-              </w:rPr>
-            </w:pPr>
-            <w:r>
-              <w:rPr>
-                <w:rFonts w:ascii="Times New Roman" w:hAnsi="Times New Roman" w:cs="Times New Roman"/>
-                <w:b/>
-                <w:sz w:val="20"/>
-                <w:szCs w:val="20"/>
-              </w:rPr>
-              <w:t>ИНФОРМАЦИЯ О ДОГОВОРЕ</w:t>
-            </w:r>
-          </w:p>
-        </w:tc>
-      </w:tr>
-      <w:tr>
-        <w:trPr>
-          <w:trHeight w:val="300"/>
-        </w:trPr>
-        <w:tc>
-          <w:tcPr>
-            <w:tcW w:w="1731" w:type="dxa"/>
-            <w:vAlign w:val="center"/>
-            <w:hideMark/>
-          </w:tcPr>
-          <w:p>
-            <w:pPr>
-              <w:jc w:val="center"/>
-              <w:rPr>
-                <w:rFonts w:ascii="Times New Roman" w:hAnsi="Times New Roman" w:cs="Times New Roman"/>
-                <w:b/>
-                <w:sz w:val="20"/>
-                <w:szCs w:val="20"/>
-              </w:rPr>
-            </w:pPr>
-            <w:r>
-              <w:rPr>
-                <w:rFonts w:ascii="Times New Roman" w:hAnsi="Times New Roman" w:cs="Times New Roman"/>
-                <w:b/>
-                <w:sz w:val="20"/>
-                <w:szCs w:val="20"/>
-              </w:rPr>
-              <w:t xml:space="preserve">Название: </w:t>
-            </w:r>
-          </w:p>
-        </w:tc>
-        <w:tc>
-          <w:tcPr>
-            <w:tcW w:w="5459" w:type="dxa"/>
-            <w:gridSpan w:val="3"/>
-            <w:vAlign w:val="center"/>
-            <w:hideMark/>
-          </w:tcPr>
-          <w:p>
-            <w:pPr>
-              <w:jc w:val="center"/>
-              <w:rPr>
-                <w:rFonts w:ascii="Times New Roman" w:hAnsi="Times New Roman" w:cs="Times New Roman"/>
-                <w:sz w:val="20"/>
-                <w:szCs w:val="20"/>
-              </w:rPr>
-            </w:pPr>
-            <w:r>
-              <w:rPr>
-                <w:rFonts w:ascii="Times New Roman" w:hAnsi="Times New Roman" w:cs="Times New Roman"/>
-                <w:sz w:val="20"/>
-                <w:szCs w:val="20"/>
-              </w:rPr>
-              <w:t>ООО «СПД»</w:t>
-            </w:r>
-          </w:p>
-        </w:tc>
-        <w:tc>
-          <w:tcPr>
-            <w:tcW w:w="1534" w:type="dxa"/>
-            <w:vAlign w:val="center"/>
-            <w:hideMark/>
-          </w:tcPr>
-          <w:p>
-            <w:pPr>
-              <w:jc w:val="center"/>
-              <w:rPr>
-                <w:rFonts w:ascii="Times New Roman" w:hAnsi="Times New Roman" w:cs="Times New Roman"/>
-                <w:b/>
-                <w:sz w:val="20"/>
-                <w:szCs w:val="20"/>
-              </w:rPr>
-            </w:pPr>
-            <w:r>
-              <w:rPr>
-                <w:rFonts w:ascii="Times New Roman" w:hAnsi="Times New Roman" w:cs="Times New Roman"/>
-                <w:b/>
-                <w:sz w:val="20"/>
-                <w:szCs w:val="20"/>
-              </w:rPr>
-              <w:t>Номер</w:t>
-            </w:r>
-          </w:p>
-        </w:tc>
-        <w:tc>
-          <w:tcPr>
-            <w:tcW w:w="1697" w:type="dxa"/>
-            <w:vAlign w:val="center"/>
-            <w:hideMark/>
-          </w:tcPr>
-          <w:p>
-            <w:pPr>
-              <w:jc w:val="center"/>
-              <w:rPr>
-                <w:rFonts w:ascii="Times New Roman" w:hAnsi="Times New Roman" w:cs="Times New Roman"/>
-                <w:bCs/>
-                <w:sz w:val="20"/>
-                <w:szCs w:val="20"/>
-              </w:rPr>
-            </w:pPr>
-            <w:r>
-              <w:rPr>
-                <w:rFonts w:ascii="Times New Roman" w:hAnsi="Times New Roman" w:cs="Times New Roman"/>
-                <w:bCs/>
-                <w:sz w:val="20"/>
-                <w:szCs w:val="20"/>
-              </w:rPr>
-              <w:t>MOS/25/0008</w:t>
-            </w:r>
-          </w:p>
-        </w:tc>
-      </w:tr>
-      <w:tr>
-        <w:trPr>
-          <w:trHeight w:val="300"/>
-        </w:trPr>
-        <w:tc>
-          <w:tcPr>
-            <w:tcW w:w="1731" w:type="dxa"/>
-            <w:vAlign w:val="center"/>
-            <w:hideMark/>
-          </w:tcPr>
-          <w:p>
-            <w:pPr>
-              <w:jc w:val="center"/>
-              <w:rPr>
-                <w:rFonts w:ascii="Times New Roman" w:hAnsi="Times New Roman" w:cs="Times New Roman"/>
-                <w:b/>
-                <w:sz w:val="20"/>
-                <w:szCs w:val="20"/>
-              </w:rPr>
-            </w:pPr>
-            <w:r>
-              <w:rPr>
-                <w:rFonts w:ascii="Times New Roman" w:hAnsi="Times New Roman" w:cs="Times New Roman"/>
-                <w:b/>
-                <w:sz w:val="20"/>
-                <w:szCs w:val="20"/>
-              </w:rPr>
-              <w:t>Адрес:</w:t>
-            </w:r>
-          </w:p>
-        </w:tc>
-        <w:tc>
-          <w:tcPr>
-            <w:tcW w:w="5459" w:type="dxa"/>
-            <w:gridSpan w:val="3"/>
-            <w:noWrap/>
-            <w:vAlign w:val="center"/>
-            <w:hideMark/>
-          </w:tcPr>
-          <w:p>
-            <w:pPr>
-              <w:jc w:val="center"/>
-              <w:rPr>
-                <w:rFonts w:ascii="Times New Roman" w:hAnsi="Times New Roman" w:cs="Times New Roman"/>
-                <w:sz w:val="20"/>
-                <w:szCs w:val="20"/>
-              </w:rPr>
-            </w:pPr>
-            <w:r>
-              <w:rPr>
-                <w:rFonts w:ascii="Times New Roman" w:hAnsi="Times New Roman" w:cs="Times New Roman"/>
-                <w:sz w:val="20"/>
-                <w:szCs w:val="20"/>
-              </w:rPr>
-              <w:t>123242, г. Москва, Новинский бульвар, 31, 6 этаж</w:t>
-            </w:r>
-          </w:p>
-        </w:tc>
-        <w:tc>
-          <w:tcPr>
-            <w:tcW w:w="1534" w:type="dxa"/>
-            <w:vAlign w:val="center"/>
-            <w:hideMark/>
-          </w:tcPr>
-          <w:p>
-            <w:pPr>
-              <w:jc w:val="center"/>
-              <w:rPr>
-                <w:rFonts w:ascii="Times New Roman" w:hAnsi="Times New Roman" w:cs="Times New Roman"/>
-                <w:b/>
-                <w:sz w:val="20"/>
-                <w:szCs w:val="20"/>
-              </w:rPr>
-            </w:pPr>
-            <w:r>
-              <w:rPr>
-                <w:rFonts w:ascii="Times New Roman" w:hAnsi="Times New Roman" w:cs="Times New Roman"/>
-                <w:b/>
-                <w:sz w:val="20"/>
-                <w:szCs w:val="20"/>
-              </w:rPr>
-              <w:t xml:space="preserve">Дата </w:t>
-            </w:r>
-          </w:p>
-        </w:tc>
-        <w:tc>
-          <w:tcPr>
-            <w:tcW w:w="1697" w:type="dxa"/>
-            <w:vAlign w:val="center"/>
-            <w:hideMark/>
-          </w:tcPr>
-          <w:p>
-            <w:pPr>
-              <w:jc w:val="center"/>
-              <w:rPr>
-                <w:rFonts w:ascii="Times New Roman" w:hAnsi="Times New Roman" w:cs="Times New Roman"/>
-                <w:bCs/>
-                <w:sz w:val="20"/>
-                <w:szCs w:val="20"/>
-              </w:rPr>
-            </w:pPr>
-            <w:r>
-              <w:rPr>
-                <w:rFonts w:ascii="Times New Roman" w:hAnsi="Times New Roman" w:cs="Times New Roman"/>
-                <w:bCs/>
-                <w:sz w:val="20"/>
-                <w:szCs w:val="20"/>
-                <w:lang w:val="en-US"/>
-              </w:rPr>
-              <w:t>01</w:t>
-            </w:r>
-            <w:r>
-              <w:rPr>
-                <w:rFonts w:ascii="Times New Roman" w:hAnsi="Times New Roman" w:cs="Times New Roman"/>
-                <w:bCs/>
-                <w:sz w:val="20"/>
-                <w:szCs w:val="20"/>
-              </w:rPr>
-              <w:t>.0</w:t>
-            </w:r>
-            <w:r>
-              <w:rPr>
-                <w:rFonts w:ascii="Times New Roman" w:hAnsi="Times New Roman" w:cs="Times New Roman"/>
-                <w:bCs/>
-                <w:sz w:val="20"/>
-                <w:szCs w:val="20"/>
-                <w:lang w:val="en-US"/>
-              </w:rPr>
-              <w:t>7</w:t>
-            </w:r>
-            <w:r>
-              <w:rPr>
-                <w:rFonts w:ascii="Times New Roman" w:hAnsi="Times New Roman" w:cs="Times New Roman"/>
-                <w:bCs/>
-                <w:sz w:val="20"/>
-                <w:szCs w:val="20"/>
-              </w:rPr>
-              <w:t>.2025</w:t>
-            </w:r>
-          </w:p>
-        </w:tc>
-      </w:tr>
-      <w:tr>
-        <w:trPr>
-          <w:trHeight w:val="300"/>
-        </w:trPr>
-        <w:tc>
-          <w:tcPr>
-            <w:tcW w:w="1731" w:type="dxa"/>
-            <w:vAlign w:val="center"/>
-            <w:hideMark/>
-          </w:tcPr>
-          <w:p>
-            <w:pPr>
-              <w:jc w:val="center"/>
-              <w:rPr>
-                <w:rFonts w:ascii="Times New Roman" w:hAnsi="Times New Roman" w:cs="Times New Roman"/>
-                <w:b/>
-                <w:sz w:val="20"/>
-                <w:szCs w:val="20"/>
-              </w:rPr>
-            </w:pPr>
-            <w:r>
-              <w:rPr>
-                <w:rFonts w:ascii="Times New Roman" w:hAnsi="Times New Roman" w:cs="Times New Roman"/>
-                <w:b/>
-                <w:sz w:val="20"/>
-                <w:szCs w:val="20"/>
-              </w:rPr>
-              <w:t>Вниманию</w:t>
-            </w:r>
-          </w:p>
-        </w:tc>
-        <w:tc>
-          <w:tcPr>
-            <w:tcW w:w="1849" w:type="dxa"/>
-            <w:vAlign w:val="center"/>
-            <w:hideMark/>
-          </w:tcPr>
-          <w:p>
-            <w:pPr>
-              <w:jc w:val="center"/>
-              <w:rPr>
-                <w:rFonts w:ascii="Times New Roman" w:hAnsi="Times New Roman" w:cs="Times New Roman"/>
-                <w:sz w:val="20"/>
-                <w:szCs w:val="20"/>
-              </w:rPr>
-            </w:pPr>
-            <w:r>
-              <w:rPr>
-                <w:rFonts w:ascii="Times New Roman" w:hAnsi="Times New Roman" w:cs="Times New Roman"/>
-                <w:sz w:val="20"/>
-                <w:szCs w:val="20"/>
-              </w:rPr>
-              <w:t> </w:t>
-            </w:r>
-          </w:p>
-        </w:tc>
-        <w:tc>
-          <w:tcPr>
-            <w:tcW w:w="1875" w:type="dxa"/>
-            <w:vAlign w:val="center"/>
-            <w:hideMark/>
-          </w:tcPr>
-          <w:p>
-            <w:pPr>
-              <w:jc w:val="center"/>
-              <w:rPr>
-                <w:rFonts w:ascii="Times New Roman" w:hAnsi="Times New Roman" w:cs="Times New Roman"/>
-                <w:sz w:val="20"/>
-                <w:szCs w:val="20"/>
-              </w:rPr>
-            </w:pPr>
-            <w:r>
-              <w:rPr>
-                <w:rFonts w:ascii="Times New Roman" w:hAnsi="Times New Roman" w:cs="Times New Roman"/>
-                <w:sz w:val="20"/>
-                <w:szCs w:val="20"/>
-              </w:rPr>
-              <w:t xml:space="preserve">Тел: </w:t>
-            </w:r>
-          </w:p>
-        </w:tc>
-        <w:tc>
-          <w:tcPr>
-            <w:tcW w:w="1735" w:type="dxa"/>
-            <w:vAlign w:val="center"/>
-            <w:hideMark/>
-          </w:tcPr>
-          <w:p>
-            <w:pPr>
-              <w:jc w:val="center"/>
-              <w:rPr>
-                <w:rFonts w:ascii="Times New Roman" w:hAnsi="Times New Roman" w:cs="Times New Roman"/>
-                <w:sz w:val="20"/>
-                <w:szCs w:val="20"/>
-              </w:rPr>
-            </w:pPr>
-            <w:r>
-              <w:rPr>
-                <w:rFonts w:ascii="Times New Roman" w:hAnsi="Times New Roman" w:cs="Times New Roman"/>
-                <w:sz w:val="20"/>
-                <w:szCs w:val="20"/>
-              </w:rPr>
-              <w:t>8(495)5189720</w:t>
-            </w:r>
-          </w:p>
-        </w:tc>
-        <w:tc>
-          <w:tcPr>
-            <w:tcW w:w="1534" w:type="dxa"/>
-            <w:vAlign w:val="center"/>
-            <w:hideMark/>
-          </w:tcPr>
-          <w:p>
-            <w:pPr>
-              <w:jc w:val="center"/>
-              <w:rPr>
-                <w:rFonts w:ascii="Times New Roman" w:hAnsi="Times New Roman" w:cs="Times New Roman"/>
-                <w:b/>
-                <w:sz w:val="20"/>
-                <w:szCs w:val="20"/>
-              </w:rPr>
-            </w:pPr>
-            <w:r>
-              <w:rPr>
-                <w:rFonts w:ascii="Times New Roman" w:hAnsi="Times New Roman" w:cs="Times New Roman"/>
-                <w:b/>
-                <w:sz w:val="20"/>
-                <w:szCs w:val="20"/>
-              </w:rPr>
-              <w:t>Наряд-заказ</w:t>
-            </w:r>
-          </w:p>
-        </w:tc>
-        <w:tc>
-          <w:tcPr>
-            <w:tcW w:w="1697" w:type="dxa"/>
-            <w:vAlign w:val="center"/>
-            <w:hideMark/>
-          </w:tcPr>
-          <w:p>
-            <w:pPr>
-              <w:jc w:val="center"/>
-              <w:rPr>
-                <w:rFonts w:ascii="Times New Roman" w:hAnsi="Times New Roman" w:cs="Times New Roman"/>
-                <w:bCs/>
-                <w:sz w:val="20"/>
-                <w:szCs w:val="20"/>
-              </w:rPr>
-            </w:pPr>
-            <w:r>
-              <w:rPr>
-                <w:rFonts w:ascii="Times New Roman" w:hAnsi="Times New Roman" w:cs="Times New Roman"/>
-                <w:bCs/>
-                <w:sz w:val="20"/>
-                <w:szCs w:val="20"/>
-              </w:rPr>
-              <w:t>1</w:t>
-            </w:r>
-          </w:p>
-        </w:tc>
-      </w:tr>
-      <w:tr>
-        <w:trPr>
-          <w:trHeight w:val="300"/>
-        </w:trPr>
-        <w:tc>
-          <w:tcPr>
-            <w:tcW w:w="1731" w:type="dxa"/>
-            <w:vAlign w:val="center"/>
-            <w:hideMark/>
-          </w:tcPr>
-          <w:p>
-            <w:pPr>
-              <w:jc w:val="center"/>
-              <w:rPr>
-                <w:rFonts w:ascii="Times New Roman" w:hAnsi="Times New Roman" w:cs="Times New Roman"/>
-                <w:b/>
-                <w:sz w:val="20"/>
-                <w:szCs w:val="20"/>
-              </w:rPr>
-            </w:pPr>
-            <w:r>
-              <w:rPr>
-                <w:rFonts w:ascii="Times New Roman" w:hAnsi="Times New Roman" w:cs="Times New Roman"/>
-                <w:b/>
-                <w:sz w:val="20"/>
-                <w:szCs w:val="20"/>
-              </w:rPr>
-              <w:t>Факс:</w:t>
-            </w:r>
-          </w:p>
-        </w:tc>
-        <w:tc>
-          <w:tcPr>
-            <w:tcW w:w="1849" w:type="dxa"/>
-            <w:vAlign w:val="center"/>
-            <w:hideMark/>
-          </w:tcPr>
-          <w:p>
-            <w:pPr>
-              <w:jc w:val="center"/>
-              <w:rPr>
-                <w:rFonts w:ascii="Times New Roman" w:hAnsi="Times New Roman" w:cs="Times New Roman"/>
-                <w:sz w:val="20"/>
-                <w:szCs w:val="20"/>
-              </w:rPr>
-            </w:pPr>
-            <w:r>
-              <w:rPr>
-                <w:rFonts w:ascii="Times New Roman" w:hAnsi="Times New Roman" w:cs="Times New Roman"/>
-                <w:sz w:val="20"/>
-                <w:szCs w:val="20"/>
-              </w:rPr>
-              <w:t> </w:t>
-            </w:r>
-          </w:p>
-        </w:tc>
-        <w:tc>
-          <w:tcPr>
-            <w:tcW w:w="1875" w:type="dxa"/>
-            <w:vAlign w:val="center"/>
-            <w:hideMark/>
-          </w:tcPr>
-          <w:p>
-            <w:pPr>
-              <w:jc w:val="center"/>
-              <w:rPr>
-                <w:rFonts w:ascii="Times New Roman" w:hAnsi="Times New Roman" w:cs="Times New Roman"/>
-                <w:sz w:val="20"/>
-                <w:szCs w:val="20"/>
-              </w:rPr>
-            </w:pPr>
-            <w:r>
-              <w:rPr>
-                <w:rFonts w:ascii="Times New Roman" w:hAnsi="Times New Roman" w:cs="Times New Roman"/>
-                <w:sz w:val="20"/>
-                <w:szCs w:val="20"/>
-              </w:rPr>
-              <w:t>e-</w:t>
-            </w:r>
-            <w:proofErr w:type="spellStart"/>
-            <w:r>
-              <w:rPr>
-                <w:rFonts w:ascii="Times New Roman" w:hAnsi="Times New Roman" w:cs="Times New Roman"/>
-                <w:sz w:val="20"/>
-                <w:szCs w:val="20"/>
-              </w:rPr>
-              <w:t>mail</w:t>
-            </w:r>
-            <w:proofErr w:type="spellEnd"/>
-            <w:r>
-              <w:rPr>
-                <w:rFonts w:ascii="Times New Roman" w:hAnsi="Times New Roman" w:cs="Times New Roman"/>
-                <w:sz w:val="20"/>
-                <w:szCs w:val="20"/>
-              </w:rPr>
-              <w:t xml:space="preserve">: </w:t>
-            </w:r>
-          </w:p>
-        </w:tc>
-        <w:tc>
-          <w:tcPr>
-            <w:tcW w:w="1735" w:type="dxa"/>
-            <w:vAlign w:val="center"/>
-            <w:hideMark/>
-          </w:tcPr>
-          <w:p>
-            <w:pPr>
-              <w:jc w:val="center"/>
-              <w:rPr>
-                <w:rFonts w:ascii="Times New Roman" w:hAnsi="Times New Roman" w:cs="Times New Roman"/>
-                <w:sz w:val="20"/>
-                <w:szCs w:val="20"/>
-              </w:rPr>
-            </w:pPr>
-            <w:r>
-              <w:rPr>
-                <w:rFonts w:ascii="Times New Roman" w:hAnsi="Times New Roman" w:cs="Times New Roman"/>
-                <w:sz w:val="20"/>
-                <w:szCs w:val="20"/>
-              </w:rPr>
-              <w:t>info@spd.ru</w:t>
-            </w:r>
-          </w:p>
-        </w:tc>
-        <w:tc>
-          <w:tcPr>
-            <w:tcW w:w="1534" w:type="dxa"/>
-            <w:vAlign w:val="center"/>
-            <w:hideMark/>
-          </w:tcPr>
-          <w:p>
-            <w:pPr>
-              <w:jc w:val="center"/>
-              <w:rPr>
-                <w:rFonts w:ascii="Times New Roman" w:hAnsi="Times New Roman" w:cs="Times New Roman"/>
-                <w:b/>
-                <w:sz w:val="20"/>
-                <w:szCs w:val="20"/>
-              </w:rPr>
-            </w:pPr>
-            <w:r>
-              <w:rPr>
-                <w:rFonts w:ascii="Times New Roman" w:hAnsi="Times New Roman" w:cs="Times New Roman"/>
-                <w:b/>
-                <w:sz w:val="20"/>
-                <w:szCs w:val="20"/>
-              </w:rPr>
-              <w:t>Заявка №</w:t>
-            </w:r>
-          </w:p>
-        </w:tc>
-        <w:tc>
-          <w:tcPr>
-            <w:tcW w:w="1697" w:type="dxa"/>
-            <w:vAlign w:val="center"/>
-            <w:hideMark/>
-          </w:tcPr>
-          <w:p>
-            <w:pPr>
-              <w:jc w:val="center"/>
-              <w:rPr>
-                <w:rFonts w:ascii="Times New Roman" w:hAnsi="Times New Roman" w:cs="Times New Roman"/>
-                <w:bCs/>
-                <w:sz w:val="20"/>
-                <w:szCs w:val="20"/>
-              </w:rPr>
-            </w:pPr>
-            <w:r>
-              <w:rPr>
-                <w:rFonts w:ascii="Times New Roman" w:hAnsi="Times New Roman" w:cs="Times New Roman"/>
-                <w:bCs/>
-                <w:sz w:val="20"/>
-                <w:szCs w:val="20"/>
-              </w:rPr>
-              <w:t> </w:t>
-            </w:r>
-          </w:p>
-        </w:tc>
-      </w:tr>
-      <w:tr>
-        <w:trPr>
-          <w:trHeight w:val="510"/>
-        </w:trPr>
-        <w:tc>
-          <w:tcPr>
-            <w:tcW w:w="1731" w:type="dxa"/>
-            <w:vAlign w:val="center"/>
-            <w:hideMark/>
-          </w:tcPr>
-          <w:p>
-            <w:pPr>
-              <w:jc w:val="center"/>
-              <w:rPr>
-                <w:rFonts w:ascii="Times New Roman" w:hAnsi="Times New Roman" w:cs="Times New Roman"/>
-                <w:b/>
-                <w:sz w:val="20"/>
-                <w:szCs w:val="20"/>
-              </w:rPr>
-            </w:pPr>
-            <w:r>
-              <w:rPr>
-                <w:rFonts w:ascii="Times New Roman" w:hAnsi="Times New Roman" w:cs="Times New Roman"/>
-                <w:b/>
-                <w:sz w:val="20"/>
-                <w:szCs w:val="20"/>
-              </w:rPr>
-              <w:t>Копии:</w:t>
-            </w:r>
-          </w:p>
-        </w:tc>
-        <w:tc>
-          <w:tcPr>
-            <w:tcW w:w="5459" w:type="dxa"/>
-            <w:gridSpan w:val="3"/>
-            <w:vAlign w:val="center"/>
-            <w:hideMark/>
-          </w:tcPr>
-          <w:p>
-            <w:pPr>
-              <w:jc w:val="center"/>
-              <w:rPr>
-                <w:rFonts w:ascii="Times New Roman" w:hAnsi="Times New Roman" w:cs="Times New Roman"/>
-                <w:bCs/>
-                <w:sz w:val="20"/>
-                <w:szCs w:val="20"/>
-              </w:rPr>
-            </w:pPr>
-            <w:r>
-              <w:rPr>
-                <w:rFonts w:ascii="Times New Roman" w:hAnsi="Times New Roman" w:cs="Times New Roman"/>
-                <w:bCs/>
-                <w:sz w:val="20"/>
-                <w:szCs w:val="20"/>
-              </w:rPr>
-              <w:t>Согласно списку рассылки</w:t>
-            </w:r>
-          </w:p>
-        </w:tc>
-        <w:tc>
-          <w:tcPr>
-            <w:tcW w:w="1534" w:type="dxa"/>
-            <w:vAlign w:val="center"/>
-            <w:hideMark/>
-          </w:tcPr>
-          <w:p>
-            <w:pPr>
-              <w:jc w:val="center"/>
-              <w:rPr>
-                <w:rFonts w:ascii="Times New Roman" w:hAnsi="Times New Roman" w:cs="Times New Roman"/>
-                <w:b/>
-                <w:sz w:val="20"/>
-                <w:szCs w:val="20"/>
-              </w:rPr>
-            </w:pPr>
-            <w:r>
-              <w:rPr>
-                <w:rFonts w:ascii="Times New Roman" w:hAnsi="Times New Roman" w:cs="Times New Roman"/>
-                <w:b/>
-                <w:sz w:val="20"/>
-                <w:szCs w:val="20"/>
-              </w:rPr>
-              <w:t>Руководитель</w:t>
-            </w:r>
-          </w:p>
-        </w:tc>
-        <w:tc>
-          <w:tcPr>
-            <w:tcW w:w="1697" w:type="dxa"/>
-            <w:vAlign w:val="center"/>
-            <w:hideMark/>
-          </w:tcPr>
-          <w:p>
-            <w:pPr>
-              <w:jc w:val="center"/>
-              <w:rPr>
-                <w:rFonts w:ascii="Times New Roman" w:hAnsi="Times New Roman" w:cs="Times New Roman"/>
-                <w:bCs/>
-                <w:sz w:val="20"/>
-                <w:szCs w:val="20"/>
-              </w:rPr>
-            </w:pPr>
-            <w:r>
-              <w:rPr>
-                <w:rFonts w:ascii="Times New Roman" w:hAnsi="Times New Roman" w:cs="Times New Roman"/>
-                <w:bCs/>
-                <w:sz w:val="20"/>
-                <w:szCs w:val="20"/>
-              </w:rPr>
-              <w:t>Аниськов Владимир Иванович</w:t>
-            </w:r>
-          </w:p>
-        </w:tc>
-      </w:tr>
-      <w:tr>
-        <w:trPr>
-          <w:trHeight w:val="345"/>
-        </w:trPr>
-        <w:tc>
-          <w:tcPr>
-            <w:tcW w:w="10421" w:type="dxa"/>
-            <w:gridSpan w:val="6"/>
-            <w:vAlign w:val="center"/>
-            <w:hideMark/>
-          </w:tcPr>
-          <w:p>
-            <w:pPr>
-              <w:jc w:val="center"/>
-              <w:rPr>
-                <w:rFonts w:ascii="Times New Roman" w:hAnsi="Times New Roman" w:cs="Times New Roman"/>
-                <w:b/>
-                <w:bCs/>
-                <w:sz w:val="20"/>
-                <w:szCs w:val="20"/>
-              </w:rPr>
-            </w:pPr>
-            <w:r>
-              <w:rPr>
-                <w:rFonts w:ascii="Times New Roman" w:hAnsi="Times New Roman" w:cs="Times New Roman"/>
-                <w:b/>
-                <w:bCs/>
-                <w:sz w:val="20"/>
-                <w:szCs w:val="20"/>
-              </w:rPr>
-              <w:t>ИНФОРМАЦИЯ О ПОДРЯДЧИКЕ/СУБПОДРЯДЧИКЕ</w:t>
-            </w:r>
-          </w:p>
-        </w:tc>
-      </w:tr>
-      <w:tr>
-        <w:trPr>
-          <w:trHeight w:val="300"/>
-        </w:trPr>
-        <w:tc>
-          <w:tcPr>
-            <w:tcW w:w="3580" w:type="dxa"/>
-            <w:gridSpan w:val="2"/>
-            <w:vAlign w:val="center"/>
-            <w:hideMark/>
-          </w:tcPr>
-          <w:p>
-            <w:pPr>
-              <w:jc w:val="center"/>
-              <w:rPr>
-                <w:rFonts w:ascii="Times New Roman" w:hAnsi="Times New Roman" w:cs="Times New Roman"/>
-                <w:b/>
-                <w:sz w:val="20"/>
-                <w:szCs w:val="20"/>
-              </w:rPr>
-            </w:pPr>
-            <w:r>
-              <w:rPr>
-                <w:rFonts w:ascii="Times New Roman" w:hAnsi="Times New Roman" w:cs="Times New Roman"/>
-                <w:b/>
-                <w:sz w:val="20"/>
-                <w:szCs w:val="20"/>
-              </w:rPr>
-              <w:t>Инспекция проведена:</w:t>
-            </w:r>
-          </w:p>
-        </w:tc>
-        <w:tc>
-          <w:tcPr>
-            <w:tcW w:w="3610" w:type="dxa"/>
-            <w:gridSpan w:val="2"/>
-            <w:vAlign w:val="center"/>
-            <w:hideMark/>
-          </w:tcPr>
-          <w:p>
-            <w:pPr>
-              <w:jc w:val="center"/>
-              <w:rPr>
-                <w:rFonts w:ascii="Times New Roman" w:hAnsi="Times New Roman" w:cs="Times New Roman"/>
-                <w:b/>
-                <w:bCs/>
-                <w:sz w:val="20"/>
-                <w:szCs w:val="20"/>
-                <w:highlight w:val="yellow"/>
-              </w:rPr>
-            </w:pPr>
-            <w:r>
-              <w:rPr>
-                <w:rFonts w:ascii="Times New Roman" w:hAnsi="Times New Roman" w:cs="Times New Roman"/>
-                <w:b/>
-                <w:bCs/>
-                <w:sz w:val="20"/>
-                <w:szCs w:val="20"/>
-              </w:rPr>
-              <w:t>С Подрядчиком</w:t>
-            </w:r>
-          </w:p>
-        </w:tc>
-        <w:tc>
-          <w:tcPr>
-            <w:tcW w:w="3231" w:type="dxa"/>
-            <w:gridSpan w:val="2"/>
-            <w:vAlign w:val="center"/>
-            <w:hideMark/>
-          </w:tcPr>
-          <w:p>
-            <w:pPr>
-              <w:jc w:val="center"/>
-              <w:rPr>
-                <w:rFonts w:ascii="Times New Roman" w:hAnsi="Times New Roman" w:cs="Times New Roman"/>
-                <w:strike/>
-                <w:sz w:val="20"/>
-                <w:szCs w:val="20"/>
-              </w:rPr>
-            </w:pPr>
-            <w:r>
-              <w:rPr>
-                <w:rFonts w:ascii="Times New Roman" w:hAnsi="Times New Roman" w:cs="Times New Roman"/>
-                <w:strike/>
-                <w:sz w:val="20"/>
-                <w:szCs w:val="20"/>
-              </w:rPr>
-              <w:t>С Субподрядчиком</w:t>
-            </w:r>
-          </w:p>
-        </w:tc>
-      </w:tr>
-      <w:tr>
-        <w:trPr>
-          <w:trHeight w:val="345"/>
-        </w:trPr>
-        <w:tc>
-          <w:tcPr>
-            <w:tcW w:w="1731" w:type="dxa"/>
-            <w:vAlign w:val="center"/>
-            <w:hideMark/>
-          </w:tcPr>
-          <w:p>
-            <w:pPr>
-              <w:jc w:val="center"/>
-              <w:rPr>
-                <w:rFonts w:ascii="Times New Roman" w:hAnsi="Times New Roman" w:cs="Times New Roman"/>
-                <w:b/>
-                <w:sz w:val="20"/>
-                <w:szCs w:val="20"/>
-              </w:rPr>
-            </w:pPr>
-            <w:r>
-              <w:rPr>
-                <w:rFonts w:ascii="Times New Roman" w:hAnsi="Times New Roman" w:cs="Times New Roman"/>
-                <w:b/>
-                <w:sz w:val="20"/>
-                <w:szCs w:val="20"/>
-              </w:rPr>
-              <w:t>Генподрядчик</w:t>
-            </w:r>
-          </w:p>
-        </w:tc>
-        <w:tc>
-          <w:tcPr>
-            <w:tcW w:w="8690" w:type="dxa"/>
-            <w:gridSpan w:val="5"/>
-            <w:vAlign w:val="center"/>
-          </w:tcPr>
-          <w:p>
-            <w:pPr>
-              <w:rPr>
-                <w:rFonts w:ascii="Times New Roman" w:hAnsi="Times New Roman" w:cs="Times New Roman"/>
-                <w:bCs/>
-                <w:sz w:val="20"/>
-                <w:szCs w:val="20"/>
-              </w:rPr>
-            </w:pPr>
-            <w:r>
-              <w:rPr>
-                <w:rFonts w:ascii="Times New Roman" w:hAnsi="Times New Roman" w:cs="Times New Roman"/>
-                <w:bCs/>
-                <w:sz w:val="20"/>
-                <w:szCs w:val="20"/>
-              </w:rPr>
-              <w:t>ООО «Лесные Технологии»</w:t>
-            </w:r>
-          </w:p>
-        </w:tc>
-      </w:tr>
-      <w:tr>
-        <w:trPr>
-          <w:trHeight w:val="300"/>
-        </w:trPr>
-        <w:tc>
-          <w:tcPr>
-            <w:tcW w:w="1731" w:type="dxa"/>
-            <w:vAlign w:val="center"/>
-            <w:hideMark/>
-          </w:tcPr>
-          <w:p>
-            <w:pPr>
-              <w:jc w:val="center"/>
-              <w:rPr>
-                <w:rFonts w:ascii="Times New Roman" w:hAnsi="Times New Roman" w:cs="Times New Roman"/>
-                <w:b/>
-                <w:sz w:val="20"/>
-                <w:szCs w:val="20"/>
-              </w:rPr>
-            </w:pPr>
-            <w:r>
-              <w:rPr>
-                <w:rFonts w:ascii="Times New Roman" w:hAnsi="Times New Roman" w:cs="Times New Roman"/>
-                <w:b/>
-                <w:sz w:val="20"/>
-                <w:szCs w:val="20"/>
-              </w:rPr>
-              <w:t>Субподрядчик</w:t>
-            </w:r>
-          </w:p>
-        </w:tc>
-        <w:tc>
-          <w:tcPr>
-            <w:tcW w:w="8690" w:type="dxa"/>
-            <w:gridSpan w:val="5"/>
-            <w:vAlign w:val="center"/>
-          </w:tcPr>
-          <w:p>
-            <w:pPr>
-              <w:rPr>
-                <w:rFonts w:ascii="Times New Roman" w:hAnsi="Times New Roman" w:cs="Times New Roman"/>
-                <w:bCs/>
-                <w:sz w:val="20"/>
-                <w:szCs w:val="20"/>
-              </w:rPr>
-            </w:pPr>
-          </w:p>
-        </w:tc>
-      </w:tr>
-      <w:tr>
-        <w:trPr>
-          <w:trHeight w:val="300"/>
-        </w:trPr>
-        <w:tc>
-          <w:tcPr>
-            <w:tcW w:w="1731" w:type="dxa"/>
-            <w:noWrap/>
-            <w:vAlign w:val="center"/>
-            <w:hideMark/>
-          </w:tcPr>
-          <w:p>
-            <w:pPr>
-              <w:jc w:val="center"/>
-              <w:rPr>
-                <w:rFonts w:ascii="Times New Roman" w:hAnsi="Times New Roman" w:cs="Times New Roman"/>
-                <w:b/>
-                <w:sz w:val="20"/>
-                <w:szCs w:val="20"/>
-              </w:rPr>
-            </w:pPr>
-            <w:r>
-              <w:rPr>
-                <w:rFonts w:ascii="Times New Roman" w:hAnsi="Times New Roman" w:cs="Times New Roman"/>
-                <w:b/>
-                <w:sz w:val="20"/>
-                <w:szCs w:val="20"/>
-              </w:rPr>
-              <w:t>Договор</w:t>
-            </w:r>
-          </w:p>
-        </w:tc>
-        <w:tc>
-          <w:tcPr>
-            <w:tcW w:w="8690" w:type="dxa"/>
-            <w:gridSpan w:val="5"/>
-            <w:vAlign w:val="center"/>
-          </w:tcPr>
-          <w:p>
-            <w:pPr>
-              <w:rPr>
-                <w:rFonts w:ascii="Times New Roman" w:hAnsi="Times New Roman" w:cs="Times New Roman"/>
-                <w:bCs/>
-                <w:sz w:val="20"/>
-                <w:szCs w:val="20"/>
-              </w:rPr>
-            </w:pPr>
-            <w:r>
-              <w:rPr>
-                <w:rFonts w:ascii="Times New Roman" w:hAnsi="Times New Roman" w:cs="Times New Roman"/>
-                <w:bCs/>
-                <w:sz w:val="20"/>
-                <w:szCs w:val="20"/>
-                <w:lang w:val="en-US"/>
-              </w:rPr>
-              <w:t>MOS. 18.0308 от 25.11.2019г.</w:t>
-            </w:r>
-          </w:p>
-        </w:tc>
-      </w:tr>
-      <w:tr>
-        <w:trPr>
-          <w:trHeight w:val="345"/>
-        </w:trPr>
-        <w:tc>
-          <w:tcPr>
-            <w:tcW w:w="1731" w:type="dxa"/>
-            <w:noWrap/>
-            <w:vAlign w:val="center"/>
-            <w:hideMark/>
-          </w:tcPr>
-          <w:p>
-            <w:pPr>
-              <w:jc w:val="center"/>
-              <w:rPr>
-                <w:rFonts w:ascii="Times New Roman" w:hAnsi="Times New Roman" w:cs="Times New Roman"/>
-                <w:b/>
-                <w:sz w:val="20"/>
-                <w:szCs w:val="20"/>
-              </w:rPr>
-            </w:pPr>
-            <w:r>
-              <w:rPr>
-                <w:rFonts w:ascii="Times New Roman" w:hAnsi="Times New Roman" w:cs="Times New Roman"/>
-                <w:b/>
-                <w:sz w:val="20"/>
-                <w:szCs w:val="20"/>
-              </w:rPr>
-              <w:t>Контактное лицо</w:t>
-            </w:r>
-          </w:p>
-        </w:tc>
-        <w:tc>
-          <w:tcPr>
-            <w:tcW w:w="8690" w:type="dxa"/>
-            <w:gridSpan w:val="5"/>
-            <w:vAlign w:val="center"/>
-          </w:tcPr>
-          <w:p>
-            <w:pPr>
-              <w:rPr>
-                <w:rFonts w:ascii="Times New Roman" w:hAnsi="Times New Roman" w:cs="Times New Roman"/>
-                <w:bCs/>
-                <w:sz w:val="20"/>
-                <w:szCs w:val="20"/>
-              </w:rPr>
-            </w:pPr>
-            <w:r>
-              <w:rPr>
-                <w:rFonts w:ascii="Times New Roman" w:hAnsi="Times New Roman" w:cs="Times New Roman"/>
-                <w:bCs/>
-                <w:sz w:val="20"/>
-                <w:szCs w:val="20"/>
-              </w:rPr>
-              <w:t>Начальник участка Булдаков Д.А.</w:t>
-            </w:r>
-          </w:p>
-        </w:tc>
-      </w:tr>
-      <w:tr>
-        <w:trPr>
-          <w:trHeight w:val="311"/>
-        </w:trPr>
-        <w:tc>
-          <w:tcPr>
-            <w:tcW w:w="1731" w:type="dxa"/>
-            <w:vAlign w:val="center"/>
-            <w:hideMark/>
-          </w:tcPr>
-          <w:p>
-            <w:pPr>
-              <w:jc w:val="center"/>
-              <w:rPr>
-                <w:rFonts w:ascii="Times New Roman" w:hAnsi="Times New Roman" w:cs="Times New Roman"/>
-                <w:b/>
-                <w:sz w:val="20"/>
-                <w:szCs w:val="20"/>
-              </w:rPr>
-            </w:pPr>
-            <w:r>
-              <w:rPr>
-                <w:rFonts w:ascii="Times New Roman" w:hAnsi="Times New Roman" w:cs="Times New Roman"/>
-                <w:b/>
-                <w:sz w:val="20"/>
-                <w:szCs w:val="20"/>
-              </w:rPr>
-              <w:t>Тел.:</w:t>
-            </w:r>
-          </w:p>
-        </w:tc>
-        <w:tc>
-          <w:tcPr>
-            <w:tcW w:w="3724" w:type="dxa"/>
-            <w:gridSpan w:val="2"/>
-            <w:vAlign w:val="center"/>
-            <w:hideMark/>
-          </w:tcPr>
-          <w:p>
-            <w:pPr>
-              <w:jc w:val="center"/>
-              <w:rPr>
-                <w:rFonts w:ascii="Times New Roman" w:hAnsi="Times New Roman" w:cs="Times New Roman"/>
-                <w:b/>
-                <w:sz w:val="20"/>
-                <w:szCs w:val="20"/>
-              </w:rPr>
-            </w:pPr>
-            <w:r>
-              <w:rPr>
-                <w:rFonts w:ascii="Times New Roman" w:hAnsi="Times New Roman" w:cs="Times New Roman"/>
-                <w:b/>
-                <w:sz w:val="20"/>
-                <w:szCs w:val="20"/>
-              </w:rPr>
-              <w:t>Факс:</w:t>
-            </w:r>
-          </w:p>
-        </w:tc>
-        <w:tc>
-          <w:tcPr>
-            <w:tcW w:w="3269" w:type="dxa"/>
-            <w:gridSpan w:val="2"/>
-            <w:vAlign w:val="center"/>
-            <w:hideMark/>
-          </w:tcPr>
-          <w:p>
-            <w:pPr>
-              <w:jc w:val="center"/>
-              <w:rPr>
-                <w:rFonts w:ascii="Times New Roman" w:hAnsi="Times New Roman" w:cs="Times New Roman"/>
-                <w:b/>
-                <w:sz w:val="20"/>
-                <w:szCs w:val="20"/>
-              </w:rPr>
-            </w:pPr>
-            <w:r>
-              <w:rPr>
-                <w:rFonts w:ascii="Times New Roman" w:hAnsi="Times New Roman" w:cs="Times New Roman"/>
-                <w:b/>
-                <w:sz w:val="20"/>
-                <w:szCs w:val="20"/>
-              </w:rPr>
-              <w:t xml:space="preserve">E- </w:t>
-            </w:r>
-            <w:proofErr w:type="spellStart"/>
-            <w:r>
-              <w:rPr>
-                <w:rFonts w:ascii="Times New Roman" w:hAnsi="Times New Roman" w:cs="Times New Roman"/>
-                <w:b/>
-                <w:sz w:val="20"/>
-                <w:szCs w:val="20"/>
-              </w:rPr>
-              <w:t>Mail</w:t>
-            </w:r>
-            <w:proofErr w:type="spellEnd"/>
-            <w:r>
-              <w:rPr>
-                <w:rFonts w:ascii="Times New Roman" w:hAnsi="Times New Roman" w:cs="Times New Roman"/>
-                <w:b/>
-                <w:sz w:val="20"/>
-                <w:szCs w:val="20"/>
-              </w:rPr>
-              <w:t>:</w:t>
-            </w:r>
-          </w:p>
-        </w:tc>
-        <w:tc>
-          <w:tcPr>
-            <w:tcW w:w="1697" w:type="dxa"/>
-            <w:vAlign w:val="center"/>
-            <w:hideMark/>
-          </w:tcPr>
-          <w:p>
-            <w:pPr>
-              <w:jc w:val="center"/>
-              <w:rPr>
-                <w:rFonts w:ascii="Times New Roman" w:hAnsi="Times New Roman" w:cs="Times New Roman"/>
-                <w:b/>
-                <w:sz w:val="18"/>
-                <w:szCs w:val="18"/>
-              </w:rPr>
-            </w:pPr>
-            <w:r>
-              <w:rPr>
-                <w:rFonts w:ascii="Times New Roman" w:hAnsi="Times New Roman" w:cs="Times New Roman"/>
-                <w:b/>
-                <w:sz w:val="18"/>
-                <w:szCs w:val="18"/>
-              </w:rPr>
-              <w:t>Дополнительная информация</w:t>
-            </w:r>
-          </w:p>
-        </w:tc>
-      </w:tr>
-      <w:tr>
-        <w:trPr>
-          <w:trHeight w:val="335"/>
-        </w:trPr>
-        <w:tc>
-          <w:tcPr>
-            <w:tcW w:w="1731" w:type="dxa"/>
-            <w:vAlign w:val="center"/>
-          </w:tcPr>
-          <w:p>
-            <w:pPr>
-              <w:jc w:val="center"/>
-              <w:rPr>
-                <w:rFonts w:ascii="Times New Roman" w:hAnsi="Times New Roman" w:cs="Times New Roman"/>
-                <w:bCs/>
-                <w:sz w:val="20"/>
-                <w:szCs w:val="20"/>
-              </w:rPr>
-            </w:pPr>
-            <w:r>
-              <w:rPr>
-                <w:rFonts w:ascii="Times New Roman" w:hAnsi="Times New Roman" w:cs="Times New Roman"/>
-                <w:bCs/>
-                <w:sz w:val="20"/>
-                <w:szCs w:val="20"/>
-              </w:rPr>
-              <w:t>+7 922 007 62 57</w:t>
-            </w:r>
-          </w:p>
-        </w:tc>
-        <w:tc>
-          <w:tcPr>
-            <w:tcW w:w="3724" w:type="dxa"/>
-            <w:gridSpan w:val="2"/>
-            <w:vAlign w:val="center"/>
-          </w:tcPr>
-          <w:p>
-            <w:pPr>
-              <w:jc w:val="center"/>
-              <w:rPr>
-                <w:rFonts w:ascii="Times New Roman" w:hAnsi="Times New Roman" w:cs="Times New Roman"/>
-                <w:bCs/>
-                <w:sz w:val="20"/>
-                <w:szCs w:val="20"/>
-              </w:rPr>
-            </w:pPr>
-          </w:p>
-        </w:tc>
-        <w:tc>
-          <w:tcPr>
-            <w:tcW w:w="3269" w:type="dxa"/>
-            <w:gridSpan w:val="2"/>
-            <w:vAlign w:val="center"/>
-          </w:tcPr>
-          <w:p>
-            <w:pPr>
-              <w:jc w:val="center"/>
-              <w:rPr>
-                <w:rFonts w:ascii="Times New Roman" w:hAnsi="Times New Roman" w:cs="Times New Roman"/>
-                <w:bCs/>
-                <w:sz w:val="20"/>
-                <w:szCs w:val="20"/>
-              </w:rPr>
-            </w:pPr>
-          </w:p>
-        </w:tc>
-        <w:tc>
-          <w:tcPr>
-            <w:tcW w:w="1697" w:type="dxa"/>
-            <w:noWrap/>
-            <w:vAlign w:val="center"/>
-          </w:tcPr>
-          <w:p>
-            <w:pPr>
-              <w:jc w:val="center"/>
-              <w:rPr>
-                <w:rFonts w:ascii="Times New Roman" w:hAnsi="Times New Roman" w:cs="Times New Roman"/>
-                <w:bCs/>
-                <w:sz w:val="20"/>
-                <w:szCs w:val="20"/>
-              </w:rPr>
-            </w:pPr>
-          </w:p>
-        </w:tc>
-      </w:tr>
-      <w:tr>
-        <w:trPr>
-          <w:trHeight w:val="615"/>
-        </w:trPr>
-        <w:tc>
-          <w:tcPr>
-            <w:tcW w:w="3580" w:type="dxa"/>
-            <w:gridSpan w:val="2"/>
-            <w:vAlign w:val="center"/>
-            <w:hideMark/>
-          </w:tcPr>
-          <w:p>
-            <w:pPr>
-              <w:jc w:val="center"/>
-              <w:rPr>
-                <w:rFonts w:ascii="Times New Roman" w:hAnsi="Times New Roman" w:cs="Times New Roman"/>
-                <w:b/>
-                <w:sz w:val="20"/>
-                <w:szCs w:val="20"/>
-              </w:rPr>
-            </w:pPr>
-            <w:r>
-              <w:rPr>
-                <w:rFonts w:ascii="Times New Roman" w:hAnsi="Times New Roman" w:cs="Times New Roman"/>
-                <w:b/>
-                <w:sz w:val="20"/>
-                <w:szCs w:val="20"/>
-              </w:rPr>
-              <w:t>СТАТУС СТРОИТЕЛЬНОГО</w:t>
-            </w:r>
-            <w:r>
-              <w:rPr>
-                <w:rFonts w:ascii="Times New Roman" w:hAnsi="Times New Roman" w:cs="Times New Roman"/>
-                <w:b/>
-                <w:sz w:val="20"/>
-                <w:szCs w:val="20"/>
-              </w:rPr>
-              <w:t xml:space="preserve"> </w:t>
-            </w:r>
-            <w:r>
-              <w:rPr>
-                <w:rFonts w:ascii="Times New Roman" w:hAnsi="Times New Roman" w:cs="Times New Roman"/>
-                <w:b/>
-                <w:sz w:val="20"/>
-                <w:szCs w:val="20"/>
-              </w:rPr>
-              <w:t>КОНТРОЛЯ</w:t>
-            </w:r>
-          </w:p>
-        </w:tc>
-        <w:tc>
-          <w:tcPr>
-            <w:tcW w:w="1875" w:type="dxa"/>
-            <w:vAlign w:val="center"/>
-            <w:hideMark/>
-          </w:tcPr>
-          <w:p>
-            <w:pPr>
-              <w:jc w:val="center"/>
-              <w:rPr>
-                <w:rFonts w:ascii="Times New Roman" w:hAnsi="Times New Roman" w:cs="Times New Roman"/>
-                <w:b/>
-                <w:bCs/>
-                <w:sz w:val="20"/>
-                <w:szCs w:val="20"/>
-              </w:rPr>
-            </w:pPr>
-            <w:r>
-              <w:rPr>
-                <w:rFonts w:ascii="Times New Roman" w:hAnsi="Times New Roman" w:cs="Times New Roman"/>
-                <w:b/>
-                <w:bCs/>
-                <w:sz w:val="20"/>
-                <w:szCs w:val="20"/>
-              </w:rPr>
-              <w:t>Принято</w:t>
-            </w:r>
-          </w:p>
-        </w:tc>
-        <w:tc>
-          <w:tcPr>
-            <w:tcW w:w="1735" w:type="dxa"/>
-            <w:vAlign w:val="center"/>
-            <w:hideMark/>
-          </w:tcPr>
-          <w:p>
-            <w:pPr>
-              <w:jc w:val="center"/>
-              <w:rPr>
-                <w:rFonts w:ascii="Times New Roman" w:hAnsi="Times New Roman" w:cs="Times New Roman"/>
-                <w:strike/>
-                <w:sz w:val="20"/>
-                <w:szCs w:val="20"/>
-              </w:rPr>
-            </w:pPr>
-            <w:r>
-              <w:rPr>
-                <w:rFonts w:ascii="Times New Roman" w:hAnsi="Times New Roman" w:cs="Times New Roman"/>
-                <w:strike/>
-                <w:sz w:val="20"/>
-                <w:szCs w:val="20"/>
-              </w:rPr>
-              <w:t>Обнаружено несоответствие</w:t>
-            </w:r>
-          </w:p>
-        </w:tc>
-        <w:tc>
-          <w:tcPr>
-            <w:tcW w:w="1534" w:type="dxa"/>
-            <w:vAlign w:val="center"/>
-            <w:hideMark/>
-          </w:tcPr>
-          <w:p>
-            <w:pPr>
-              <w:jc w:val="center"/>
-              <w:rPr>
-                <w:rFonts w:ascii="Times New Roman" w:hAnsi="Times New Roman" w:cs="Times New Roman"/>
-                <w:strike/>
-                <w:sz w:val="20"/>
-                <w:szCs w:val="20"/>
-              </w:rPr>
-            </w:pPr>
-            <w:r>
-              <w:rPr>
-                <w:rFonts w:ascii="Times New Roman" w:hAnsi="Times New Roman" w:cs="Times New Roman"/>
-                <w:strike/>
-                <w:sz w:val="20"/>
-                <w:szCs w:val="20"/>
-              </w:rPr>
-              <w:t>Отложено</w:t>
-            </w:r>
-          </w:p>
-        </w:tc>
-        <w:tc>
-          <w:tcPr>
-            <w:tcW w:w="1697" w:type="dxa"/>
-            <w:vAlign w:val="center"/>
-            <w:hideMark/>
-          </w:tcPr>
-          <w:p>
-            <w:pPr>
-              <w:jc w:val="center"/>
-              <w:rPr>
-                <w:rFonts w:ascii="Times New Roman" w:hAnsi="Times New Roman" w:cs="Times New Roman"/>
-                <w:strike/>
-                <w:sz w:val="20"/>
-                <w:szCs w:val="20"/>
-              </w:rPr>
-            </w:pPr>
-            <w:r>
-              <w:rPr>
-                <w:rFonts w:ascii="Times New Roman" w:hAnsi="Times New Roman" w:cs="Times New Roman"/>
-                <w:strike/>
-                <w:sz w:val="20"/>
-                <w:szCs w:val="20"/>
-              </w:rPr>
-              <w:t>Прочее</w:t>
-            </w:r>
-          </w:p>
-        </w:tc>
-      </w:tr>
-      <w:tr>
-        <w:trPr>
-          <w:trHeight w:val="510"/>
-        </w:trPr>
-        <w:tc>
-          <w:tcPr>
-            <w:tcW w:w="1731" w:type="dxa"/>
-            <w:vAlign w:val="center"/>
-            <w:hideMark/>
-          </w:tcPr>
-          <w:p>
-            <w:pPr>
-              <w:jc w:val="center"/>
-              <w:rPr>
-                <w:rFonts w:ascii="Times New Roman" w:hAnsi="Times New Roman" w:cs="Times New Roman"/>
-                <w:b/>
-                <w:sz w:val="20"/>
-                <w:szCs w:val="20"/>
-              </w:rPr>
-            </w:pPr>
-            <w:r>
-              <w:rPr>
-                <w:rFonts w:ascii="Times New Roman" w:hAnsi="Times New Roman" w:cs="Times New Roman"/>
-                <w:b/>
-                <w:sz w:val="20"/>
-                <w:szCs w:val="20"/>
-              </w:rPr>
-              <w:t>Погодная характеристика</w:t>
-            </w:r>
-          </w:p>
-        </w:tc>
-        <w:tc>
-          <w:tcPr>
-            <w:tcW w:w="5459" w:type="dxa"/>
-            <w:gridSpan w:val="3"/>
-            <w:vAlign w:val="center"/>
-            <w:hideMark/>
-          </w:tcPr>
-          <w:p>
-            <w:pPr>
-              <w:jc w:val="center"/>
-              <w:rPr>
-                <w:rFonts w:ascii="Times New Roman" w:hAnsi="Times New Roman" w:cs="Times New Roman"/>
-                <w:b/>
-                <w:sz w:val="20"/>
-                <w:szCs w:val="20"/>
-              </w:rPr>
-            </w:pPr>
-            <w:r>
-              <w:rPr>
-                <w:rFonts w:ascii="Times New Roman" w:hAnsi="Times New Roman" w:cs="Times New Roman"/>
-                <w:b/>
-                <w:sz w:val="20"/>
-                <w:szCs w:val="20"/>
-              </w:rPr>
-              <w:t>Время ведения контроля</w:t>
-            </w:r>
-          </w:p>
-        </w:tc>
-        <w:tc>
-          <w:tcPr>
-            <w:tcW w:w="3231" w:type="dxa"/>
-            <w:gridSpan w:val="2"/>
-            <w:vAlign w:val="center"/>
-            <w:hideMark/>
-          </w:tcPr>
-          <w:p>
-            <w:pPr>
-              <w:jc w:val="center"/>
-              <w:rPr>
-                <w:rFonts w:ascii="Times New Roman" w:hAnsi="Times New Roman" w:cs="Times New Roman"/>
-                <w:b/>
-                <w:sz w:val="20"/>
-                <w:szCs w:val="20"/>
-              </w:rPr>
-            </w:pPr>
-            <w:r>
-              <w:rPr>
-                <w:rFonts w:ascii="Times New Roman" w:hAnsi="Times New Roman" w:cs="Times New Roman"/>
-                <w:b/>
-                <w:sz w:val="20"/>
-                <w:szCs w:val="20"/>
-              </w:rPr>
-              <w:t>ФИО инспектора, проводившего контроль в предыдущую смену</w:t>
-            </w:r>
-          </w:p>
-        </w:tc>
-      </w:tr>
-      <w:tr>
-        <w:trPr>
-          <w:trHeight w:val="300"/>
-        </w:trPr>
-        <w:tc>
-          <w:tcPr>
-            <w:tcW w:w="1731" w:type="dxa"/>
-            <w:vAlign w:val="center"/>
-            <w:hideMark/>
-          </w:tcPr>
-          <w:p>
-            <w:pPr>
-              <w:jc w:val="center"/>
-              <w:rPr>
-                <w:rFonts w:ascii="Times New Roman" w:hAnsi="Times New Roman" w:cs="Times New Roman"/>
-                <w:bCs/>
-                <w:sz w:val="20"/>
-                <w:szCs w:val="20"/>
-                <w:highlight w:val="yellow"/>
-              </w:rPr>
-            </w:pPr>
-            <w:r>
-              <w:rPr>
-                <w:rFonts w:ascii="Times New Roman" w:hAnsi="Times New Roman" w:cs="Times New Roman"/>
-                <w:bCs/>
-                <w:sz w:val="20"/>
-                <w:szCs w:val="20"/>
-              </w:rPr>
-              <w:t>+10</w:t>
-            </w:r>
-            <w:bookmarkStart w:id="0" w:name="_GoBack"/>
-            <w:bookmarkEnd w:id="0"/>
-          </w:p>
-        </w:tc>
-        <w:tc>
-          <w:tcPr>
-            <w:tcW w:w="5459" w:type="dxa"/>
-            <w:gridSpan w:val="3"/>
-            <w:vAlign w:val="center"/>
-            <w:hideMark/>
-          </w:tcPr>
-          <w:p>
-            <w:pPr>
-              <w:jc w:val="center"/>
-              <w:rPr>
-                <w:rFonts w:ascii="Times New Roman" w:hAnsi="Times New Roman" w:cs="Times New Roman"/>
-                <w:bCs/>
-                <w:sz w:val="20"/>
-                <w:szCs w:val="20"/>
-                <w:highlight w:val="yellow"/>
-              </w:rPr>
-            </w:pPr>
-            <w:r>
-              <w:rPr>
-                <w:rFonts w:ascii="Times New Roman" w:hAnsi="Times New Roman" w:cs="Times New Roman"/>
-                <w:bCs/>
-                <w:sz w:val="20"/>
-                <w:szCs w:val="20"/>
-              </w:rPr>
-              <w:t>08:00-20:00 (дневная смена)</w:t>
-            </w:r>
-          </w:p>
-        </w:tc>
-        <w:tc>
-          <w:tcPr>
-            <w:tcW w:w="3231" w:type="dxa"/>
-            <w:gridSpan w:val="2"/>
-            <w:vAlign w:val="center"/>
-            <w:hideMark/>
-          </w:tcPr>
-          <w:p>
-            <w:pPr>
-              <w:jc w:val="center"/>
-              <w:rPr>
-                <w:rFonts w:ascii="Times New Roman" w:hAnsi="Times New Roman" w:cs="Times New Roman"/>
-                <w:bCs/>
-                <w:sz w:val="20"/>
-                <w:szCs w:val="20"/>
-                <w:highlight w:val="yellow"/>
-              </w:rPr>
-            </w:pPr>
-            <w:r>
-              <w:rPr>
-                <w:rFonts w:ascii="Times New Roman" w:hAnsi="Times New Roman" w:cs="Times New Roman"/>
-                <w:bCs/>
-                <w:sz w:val="20"/>
-                <w:szCs w:val="20"/>
-              </w:rPr>
-              <w:t>Бадаев Валентин Борисович</w:t>
-            </w:r>
-          </w:p>
-        </w:tc>
-      </w:tr>
-      <w:tr>
-        <w:trPr>
-          <w:trHeight w:val="345"/>
-        </w:trPr>
-        <w:tc>
-          <w:tcPr>
-            <w:tcW w:w="10421" w:type="dxa"/>
-            <w:gridSpan w:val="6"/>
-            <w:vAlign w:val="center"/>
-            <w:hideMark/>
-          </w:tcPr>
-          <w:p>
-            <w:pPr>
-              <w:jc w:val="center"/>
-              <w:rPr>
-                <w:rFonts w:ascii="Times New Roman" w:hAnsi="Times New Roman" w:cs="Times New Roman"/>
-                <w:b/>
-                <w:bCs/>
-                <w:sz w:val="20"/>
-                <w:szCs w:val="20"/>
-              </w:rPr>
-            </w:pPr>
-            <w:r>
-              <w:rPr>
-                <w:rFonts w:ascii="Times New Roman" w:hAnsi="Times New Roman" w:cs="Times New Roman"/>
-                <w:b/>
-                <w:bCs/>
-                <w:sz w:val="20"/>
-                <w:szCs w:val="20"/>
-              </w:rPr>
-              <w:t>РЕЗУЛЬТАТ СТРОИТЕЛЬНОГО КОНТРОЛЯ И ВЫВОД</w:t>
-            </w:r>
-          </w:p>
-        </w:tc>
-      </w:tr>
-      <w:tr>
-        <w:trPr>
-          <w:trHeight w:val="300"/>
-        </w:trPr>
-        <w:tc>
-          <w:tcPr>
-            <w:tcW w:w="7190" w:type="dxa"/>
-            <w:gridSpan w:val="4"/>
-            <w:hideMark/>
-          </w:tcPr>
-          <w:p>
-            <w:pPr>
-              <w:jc w:val="center"/>
-              <w:rPr>
-                <w:rFonts w:ascii="Times New Roman" w:hAnsi="Times New Roman" w:cs="Times New Roman"/>
-                <w:b/>
-                <w:bCs/>
-                <w:sz w:val="20"/>
-                <w:szCs w:val="20"/>
-              </w:rPr>
-            </w:pPr>
-            <w:r>
-              <w:rPr>
-                <w:rFonts w:ascii="Times New Roman" w:hAnsi="Times New Roman" w:cs="Times New Roman"/>
-                <w:b/>
-                <w:bCs/>
-                <w:sz w:val="20"/>
-                <w:szCs w:val="20"/>
-              </w:rPr>
-              <w:t>Описание действий</w:t>
-            </w:r>
-          </w:p>
-        </w:tc>
-        <w:tc>
-          <w:tcPr>
-            <w:tcW w:w="1534" w:type="dxa"/>
-            <w:hideMark/>
-          </w:tcPr>
-          <w:p>
-            <w:pPr>
-              <w:jc w:val="center"/>
-              <w:rPr>
-                <w:rFonts w:ascii="Times New Roman" w:hAnsi="Times New Roman" w:cs="Times New Roman"/>
-                <w:b/>
-                <w:bCs/>
-                <w:sz w:val="20"/>
-                <w:szCs w:val="20"/>
-              </w:rPr>
-            </w:pPr>
-            <w:r>
-              <w:rPr>
-                <w:rFonts w:ascii="Times New Roman" w:hAnsi="Times New Roman" w:cs="Times New Roman"/>
-                <w:b/>
-                <w:bCs/>
-                <w:sz w:val="20"/>
-                <w:szCs w:val="20"/>
-              </w:rPr>
-              <w:t>Участок, ПК</w:t>
-            </w:r>
-          </w:p>
-        </w:tc>
-        <w:tc>
-          <w:tcPr>
-            <w:tcW w:w="1697" w:type="dxa"/>
-            <w:hideMark/>
-          </w:tcPr>
-          <w:p>
-            <w:pPr>
-              <w:jc w:val="center"/>
-              <w:rPr>
-                <w:rFonts w:ascii="Times New Roman" w:hAnsi="Times New Roman" w:cs="Times New Roman"/>
-                <w:b/>
-                <w:bCs/>
-                <w:sz w:val="20"/>
-                <w:szCs w:val="20"/>
-              </w:rPr>
-            </w:pPr>
-            <w:r>
-              <w:rPr>
-                <w:rFonts w:ascii="Times New Roman" w:hAnsi="Times New Roman" w:cs="Times New Roman"/>
-                <w:b/>
-                <w:bCs/>
-                <w:sz w:val="20"/>
-                <w:szCs w:val="20"/>
-              </w:rPr>
-              <w:t>Ссылка</w:t>
-            </w:r>
-          </w:p>
-        </w:tc>
-      </w:tr>
-      <w:tr>
-        <w:trPr>
-          <w:trHeight w:val="300"/>
-        </w:trPr>
-        <w:tc>
-          <w:tcPr>
-            <w:tcW w:w="7190" w:type="dxa"/>
-            <w:gridSpan w:val="4"/>
-            <w:noWrap/>
-            <w:hideMark/>
-          </w:tcPr>
-          <w:p>
-            <w:pPr>
-              <w:rPr>
-                <w:rFonts w:ascii="Times New Roman" w:hAnsi="Times New Roman" w:cs="Times New Roman"/>
-                <w:bCs/>
-                <w:sz w:val="20"/>
-                <w:szCs w:val="20"/>
-                <w:highlight w:val="yellow"/>
-              </w:rPr>
-            </w:pPr>
-          </w:p>
-        </w:tc>
-        <w:tc>
-          <w:tcPr>
-            <w:tcW w:w="1534" w:type="dxa"/>
-            <w:noWrap/>
-          </w:tcPr>
-          <w:p>
-            <w:pPr>
-              <w:jc w:val="center"/>
-              <w:rPr>
-                <w:rFonts w:ascii="Times New Roman" w:hAnsi="Times New Roman" w:cs="Times New Roman"/>
-                <w:bCs/>
-                <w:sz w:val="20"/>
-                <w:szCs w:val="20"/>
-                <w:highlight w:val="yellow"/>
-              </w:rPr>
-            </w:pPr>
-          </w:p>
-        </w:tc>
-        <w:tc>
-          <w:tcPr>
-            <w:tcW w:w="1697" w:type="dxa"/>
-            <w:noWrap/>
-          </w:tcPr>
-          <w:p>
-            <w:pPr>
-              <w:jc w:val="center"/>
-              <w:rPr>
-                <w:rFonts w:ascii="Times New Roman" w:hAnsi="Times New Roman" w:cs="Times New Roman"/>
-                <w:bCs/>
-                <w:sz w:val="20"/>
-                <w:szCs w:val="20"/>
-                <w:highlight w:val="yellow"/>
-              </w:rPr>
-            </w:pPr>
-          </w:p>
-        </w:tc>
-      </w:tr>
-      <w:tr>
-        <w:trPr>
-          <w:trHeight w:val="22"/>
-        </w:trPr>
-        <w:tc>
-          <w:tcPr>
-            <w:tcW w:w="3580" w:type="dxa"/>
-            <w:gridSpan w:val="2"/>
-            <w:noWrap/>
-          </w:tcPr>
-          <w:p>
-            <w:pPr>
-              <w:jc w:val="center"/>
-              <w:rPr>
-                <w:rFonts w:ascii="Times New Roman" w:hAnsi="Times New Roman" w:cs="Times New Roman"/>
-                <w:bCs/>
-                <w:sz w:val="20"/>
-                <w:szCs w:val="20"/>
-                <w:highlight w:val="yellow"/>
-              </w:rPr>
-            </w:pPr>
-          </w:p>
-        </w:tc>
-        <w:tc>
-          <w:tcPr>
-            <w:tcW w:w="3610" w:type="dxa"/>
-            <w:gridSpan w:val="2"/>
-            <w:noWrap/>
-          </w:tcPr>
-          <w:p>
-            <w:pPr>
-              <w:jc w:val="center"/>
-              <w:rPr>
-                <w:rFonts w:ascii="Times New Roman" w:hAnsi="Times New Roman" w:cs="Times New Roman"/>
-                <w:bCs/>
-                <w:sz w:val="20"/>
-                <w:szCs w:val="20"/>
-                <w:highlight w:val="yellow"/>
-              </w:rPr>
-            </w:pPr>
-          </w:p>
-        </w:tc>
-        <w:tc>
-          <w:tcPr>
-            <w:tcW w:w="1534" w:type="dxa"/>
-            <w:noWrap/>
-          </w:tcPr>
-          <w:p>
-            <w:pPr>
-              <w:jc w:val="center"/>
-              <w:rPr>
-                <w:rFonts w:ascii="Times New Roman" w:hAnsi="Times New Roman" w:cs="Times New Roman"/>
-                <w:bCs/>
-                <w:sz w:val="20"/>
-                <w:szCs w:val="20"/>
-              </w:rPr>
-            </w:pPr>
-          </w:p>
-        </w:tc>
-        <w:tc>
-          <w:tcPr>
-            <w:tcW w:w="1697" w:type="dxa"/>
-            <w:noWrap/>
-          </w:tcPr>
-          <w:p>
-            <w:pPr>
-              <w:jc w:val="center"/>
-              <w:rPr>
-                <w:rFonts w:ascii="Times New Roman" w:hAnsi="Times New Roman" w:cs="Times New Roman"/>
-                <w:bCs/>
-                <w:sz w:val="20"/>
-                <w:szCs w:val="20"/>
-              </w:rPr>
-            </w:pPr>
-          </w:p>
-        </w:tc>
-      </w:tr>
-      <w:tr>
-        <w:trPr>
-          <w:trHeight w:val="315"/>
-        </w:trPr>
-        <w:tc>
-          <w:tcPr>
-            <w:tcW w:w="10421" w:type="dxa"/>
-            <w:gridSpan w:val="6"/>
-            <w:vAlign w:val="center"/>
-            <w:hideMark/>
-          </w:tcPr>
-          <w:p>
-            <w:pPr>
-              <w:jc w:val="center"/>
-              <w:rPr>
-                <w:rFonts w:ascii="Times New Roman" w:hAnsi="Times New Roman" w:cs="Times New Roman"/>
-                <w:b/>
-                <w:bCs/>
-                <w:sz w:val="20"/>
-                <w:szCs w:val="20"/>
-              </w:rPr>
-            </w:pPr>
-            <w:r>
-              <w:rPr>
-                <w:rFonts w:ascii="Times New Roman" w:hAnsi="Times New Roman" w:cs="Times New Roman"/>
-                <w:b/>
-                <w:bCs/>
-                <w:sz w:val="20"/>
-                <w:szCs w:val="20"/>
-              </w:rPr>
-              <w:t>РЕЗУЛЬТАТ ДУБЛИРУЮЩЕГО КОНТРОЛЯ</w:t>
-            </w:r>
-          </w:p>
-        </w:tc>
-      </w:tr>
-      <w:tr>
-        <w:trPr>
-          <w:trHeight w:val="300"/>
-        </w:trPr>
-        <w:tc>
-          <w:tcPr>
-            <w:tcW w:w="7190" w:type="dxa"/>
-            <w:gridSpan w:val="4"/>
-            <w:vAlign w:val="center"/>
-            <w:hideMark/>
-          </w:tcPr>
-          <w:p>
-            <w:pPr>
-              <w:jc w:val="center"/>
-              <w:rPr>
-                <w:rFonts w:ascii="Times New Roman" w:hAnsi="Times New Roman" w:cs="Times New Roman"/>
-                <w:b/>
-                <w:bCs/>
-                <w:sz w:val="20"/>
-                <w:szCs w:val="20"/>
-              </w:rPr>
-            </w:pPr>
-            <w:r>
-              <w:rPr>
-                <w:rFonts w:ascii="Times New Roman" w:hAnsi="Times New Roman" w:cs="Times New Roman"/>
-                <w:b/>
-                <w:bCs/>
-                <w:sz w:val="20"/>
-                <w:szCs w:val="20"/>
-              </w:rPr>
-              <w:t>Описание действий</w:t>
-            </w:r>
-          </w:p>
-        </w:tc>
-        <w:tc>
-          <w:tcPr>
-            <w:tcW w:w="1534" w:type="dxa"/>
-            <w:vAlign w:val="center"/>
-            <w:hideMark/>
-          </w:tcPr>
-          <w:p>
-            <w:pPr>
-              <w:jc w:val="center"/>
-              <w:rPr>
-                <w:rFonts w:ascii="Times New Roman" w:hAnsi="Times New Roman" w:cs="Times New Roman"/>
-                <w:b/>
-                <w:bCs/>
-                <w:sz w:val="20"/>
-                <w:szCs w:val="20"/>
-              </w:rPr>
-            </w:pPr>
-            <w:r>
-              <w:rPr>
-                <w:rFonts w:ascii="Times New Roman" w:hAnsi="Times New Roman" w:cs="Times New Roman"/>
-                <w:b/>
-                <w:bCs/>
-                <w:sz w:val="20"/>
-                <w:szCs w:val="20"/>
-              </w:rPr>
-              <w:t>Участок, ПК</w:t>
-            </w:r>
-          </w:p>
-        </w:tc>
-        <w:tc>
-          <w:tcPr>
-            <w:tcW w:w="1697" w:type="dxa"/>
-            <w:vAlign w:val="center"/>
-            <w:hideMark/>
-          </w:tcPr>
-          <w:p>
-            <w:pPr>
-              <w:jc w:val="center"/>
-              <w:rPr>
-                <w:rFonts w:ascii="Times New Roman" w:hAnsi="Times New Roman" w:cs="Times New Roman"/>
-                <w:b/>
-                <w:bCs/>
-                <w:sz w:val="20"/>
-                <w:szCs w:val="20"/>
-              </w:rPr>
-            </w:pPr>
-            <w:r>
-              <w:rPr>
-                <w:rFonts w:ascii="Times New Roman" w:hAnsi="Times New Roman" w:cs="Times New Roman"/>
-                <w:b/>
-                <w:bCs/>
-                <w:sz w:val="20"/>
-                <w:szCs w:val="20"/>
-              </w:rPr>
-              <w:t>№ акта, схема</w:t>
-            </w:r>
-          </w:p>
-        </w:tc>
-      </w:tr>
-      <w:tr>
-        <w:trPr>
-          <w:trHeight w:val="300"/>
-        </w:trPr>
-        <w:tc>
-          <w:tcPr>
-            <w:tcW w:w="7190" w:type="dxa"/>
-            <w:gridSpan w:val="4"/>
-            <w:noWrap/>
-          </w:tcPr>
-          <w:p>
-            <w:pPr>
-              <w:rPr>
-                <w:rFonts w:ascii="Times New Roman" w:hAnsi="Times New Roman" w:cs="Times New Roman"/>
-                <w:b/>
-                <w:bCs/>
-                <w:sz w:val="20"/>
-                <w:szCs w:val="20"/>
-                <w:highlight w:val="yellow"/>
-              </w:rPr>
-            </w:pPr>
-            <w:r>
-              <w:rPr>
-                <w:rFonts w:ascii="Times New Roman" w:hAnsi="Times New Roman" w:cs="Times New Roman"/>
-                <w:b/>
-                <w:bCs/>
-                <w:sz w:val="20"/>
-                <w:szCs w:val="20"/>
-              </w:rPr>
-              <w:t>Дублирующий</w:t>
-            </w:r>
-            <w:r>
-              <w:rPr>
-                <w:rFonts w:ascii="Times New Roman" w:hAnsi="Times New Roman" w:cs="Times New Roman"/>
-                <w:b/>
-                <w:bCs/>
-                <w:sz w:val="20"/>
-                <w:szCs w:val="20"/>
-              </w:rPr>
-              <w:t xml:space="preserve"> камеральный</w:t>
-            </w:r>
-            <w:r>
-              <w:rPr>
-                <w:rFonts w:ascii="Times New Roman" w:hAnsi="Times New Roman" w:cs="Times New Roman"/>
-                <w:b/>
-                <w:bCs/>
-                <w:sz w:val="20"/>
-                <w:szCs w:val="20"/>
-              </w:rPr>
-              <w:t xml:space="preserve"> </w:t>
-            </w:r>
-            <w:r>
-              <w:rPr>
-                <w:rFonts w:ascii="Times New Roman" w:hAnsi="Times New Roman" w:cs="Times New Roman"/>
-                <w:b/>
-                <w:bCs/>
-                <w:sz w:val="20"/>
-                <w:szCs w:val="20"/>
-              </w:rPr>
-              <w:t xml:space="preserve">геодезический </w:t>
-            </w:r>
-            <w:r>
-              <w:rPr>
-                <w:rFonts w:ascii="Times New Roman" w:hAnsi="Times New Roman" w:cs="Times New Roman"/>
-                <w:b/>
-                <w:bCs/>
-                <w:sz w:val="20"/>
-                <w:szCs w:val="20"/>
-              </w:rPr>
-              <w:t xml:space="preserve">контроль </w:t>
-            </w:r>
-            <w:r>
-              <w:rPr>
-                <w:rFonts w:ascii="Times New Roman" w:hAnsi="Times New Roman" w:cs="Times New Roman"/>
-                <w:b/>
-                <w:bCs/>
-                <w:sz w:val="20"/>
-                <w:szCs w:val="20"/>
-              </w:rPr>
-              <w:t xml:space="preserve"> </w:t>
-            </w:r>
-            <w:r>
-              <w:rPr>
-                <w:rFonts w:ascii="Times New Roman" w:hAnsi="Times New Roman" w:cs="Times New Roman"/>
-                <w:b/>
-                <w:bCs/>
-                <w:sz w:val="20"/>
-                <w:szCs w:val="20"/>
-              </w:rPr>
-              <w:t>к</w:t>
-            </w:r>
-            <w:r>
-              <w:rPr>
-                <w:rFonts w:ascii="Times New Roman" w:hAnsi="Times New Roman" w:cs="Times New Roman"/>
-                <w:b/>
-                <w:bCs/>
-                <w:sz w:val="20"/>
-                <w:szCs w:val="20"/>
-              </w:rPr>
-              <w:t>омплекс</w:t>
-            </w:r>
-            <w:r>
-              <w:rPr>
-                <w:rFonts w:ascii="Times New Roman" w:hAnsi="Times New Roman" w:cs="Times New Roman"/>
-                <w:b/>
-                <w:bCs/>
-                <w:sz w:val="20"/>
-                <w:szCs w:val="20"/>
-              </w:rPr>
-              <w:t>а</w:t>
-            </w:r>
-            <w:r>
-              <w:rPr>
-                <w:rFonts w:ascii="Times New Roman" w:hAnsi="Times New Roman" w:cs="Times New Roman"/>
-                <w:b/>
-                <w:bCs/>
-                <w:sz w:val="20"/>
-                <w:szCs w:val="20"/>
-              </w:rPr>
-              <w:t xml:space="preserve"> работ по валке деревьев с корня</w:t>
-            </w:r>
-          </w:p>
-        </w:tc>
-        <w:tc>
-          <w:tcPr>
-            <w:tcW w:w="1534" w:type="dxa"/>
-            <w:noWrap/>
-          </w:tcPr>
-          <w:p>
-            <w:pPr>
-              <w:jc w:val="center"/>
-              <w:rPr>
-                <w:rFonts w:ascii="Times New Roman" w:hAnsi="Times New Roman" w:cs="Times New Roman"/>
-                <w:bCs/>
-                <w:sz w:val="20"/>
-                <w:szCs w:val="20"/>
-              </w:rPr>
-            </w:pPr>
-            <w:r>
-              <w:rPr>
-                <w:rFonts w:ascii="Times New Roman" w:hAnsi="Times New Roman" w:cs="Times New Roman"/>
-                <w:bCs/>
-                <w:sz w:val="20"/>
-                <w:szCs w:val="20"/>
-                <w:lang w:val="en-US"/>
-              </w:rPr>
-              <w:t>SUP</w:t>
-            </w:r>
-            <w:r>
-              <w:rPr>
-                <w:rFonts w:ascii="Times New Roman" w:hAnsi="Times New Roman" w:cs="Times New Roman"/>
-                <w:bCs/>
-                <w:sz w:val="20"/>
-                <w:szCs w:val="20"/>
-              </w:rPr>
-              <w:t>-</w:t>
-            </w:r>
-            <w:r>
-              <w:rPr>
-                <w:rFonts w:ascii="Times New Roman" w:hAnsi="Times New Roman" w:cs="Times New Roman"/>
-                <w:bCs/>
-                <w:sz w:val="20"/>
-                <w:szCs w:val="20"/>
-                <w:lang w:val="en-US"/>
-              </w:rPr>
-              <w:t>WLL</w:t>
-            </w:r>
-            <w:r>
-              <w:rPr>
-                <w:rFonts w:ascii="Times New Roman" w:hAnsi="Times New Roman" w:cs="Times New Roman"/>
-                <w:bCs/>
-                <w:sz w:val="20"/>
-                <w:szCs w:val="20"/>
-              </w:rPr>
-              <w:t>-</w:t>
-            </w:r>
-            <w:r>
-              <w:rPr>
-                <w:rFonts w:ascii="Times New Roman" w:hAnsi="Times New Roman" w:cs="Times New Roman"/>
-                <w:bCs/>
-                <w:sz w:val="20"/>
-                <w:szCs w:val="20"/>
-                <w:lang w:val="en-US"/>
-              </w:rPr>
-              <w:t>K</w:t>
-            </w:r>
-            <w:r>
-              <w:rPr>
-                <w:rFonts w:ascii="Times New Roman" w:hAnsi="Times New Roman" w:cs="Times New Roman"/>
-                <w:bCs/>
-                <w:sz w:val="20"/>
-                <w:szCs w:val="20"/>
-              </w:rPr>
-              <w:t>001-007-</w:t>
-            </w:r>
-            <w:r>
-              <w:rPr>
-                <w:rFonts w:ascii="Times New Roman" w:hAnsi="Times New Roman" w:cs="Times New Roman"/>
-                <w:bCs/>
-                <w:sz w:val="20"/>
-                <w:szCs w:val="20"/>
-                <w:lang w:val="en-US"/>
-              </w:rPr>
-              <w:t>DD</w:t>
-            </w:r>
-            <w:r>
-              <w:rPr>
-                <w:rFonts w:ascii="Times New Roman" w:hAnsi="Times New Roman" w:cs="Times New Roman"/>
-                <w:bCs/>
-                <w:sz w:val="20"/>
-                <w:szCs w:val="20"/>
-              </w:rPr>
-              <w:t>-00-</w:t>
-            </w:r>
-            <w:r>
-              <w:rPr>
-                <w:rFonts w:ascii="Times New Roman" w:hAnsi="Times New Roman" w:cs="Times New Roman"/>
-                <w:bCs/>
-                <w:sz w:val="20"/>
-                <w:szCs w:val="20"/>
-                <w:lang w:val="en-US"/>
-              </w:rPr>
-              <w:t>RL</w:t>
-            </w:r>
-          </w:p>
-          <w:p>
-            <w:pPr>
-              <w:jc w:val="center"/>
-              <w:rPr>
-                <w:rFonts w:ascii="Times New Roman" w:hAnsi="Times New Roman" w:cs="Times New Roman"/>
-                <w:bCs/>
-                <w:sz w:val="20"/>
-                <w:szCs w:val="20"/>
-                <w:highlight w:val="yellow"/>
-              </w:rPr>
-            </w:pPr>
-            <w:r>
-              <w:rPr>
-                <w:rFonts w:ascii="Times New Roman" w:hAnsi="Times New Roman" w:cs="Times New Roman"/>
-                <w:bCs/>
-                <w:sz w:val="20"/>
-                <w:szCs w:val="20"/>
-              </w:rPr>
-              <w:t>Этап строительства №1: Куст скважин № 1 (группа 2)</w:t>
-            </w:r>
-          </w:p>
-        </w:tc>
-        <w:tc>
-          <w:tcPr>
-            <w:tcW w:w="1697" w:type="dxa"/>
-            <w:noWrap/>
-          </w:tcPr>
-          <w:p>
-            <w:pPr>
-              <w:jc w:val="center"/>
-              <w:rPr>
-                <w:rFonts w:ascii="Times New Roman" w:hAnsi="Times New Roman" w:cs="Times New Roman"/>
-                <w:bCs/>
-                <w:sz w:val="20"/>
-                <w:szCs w:val="20"/>
-                <w:highlight w:val="yellow"/>
-              </w:rPr>
-            </w:pPr>
-            <w:r>
-              <w:rPr>
-                <w:rFonts w:ascii="Times New Roman" w:hAnsi="Times New Roman" w:cs="Times New Roman"/>
-                <w:bCs/>
-                <w:sz w:val="20"/>
-                <w:szCs w:val="20"/>
-              </w:rPr>
-              <w:t>б/н</w:t>
-            </w:r>
-          </w:p>
-        </w:tc>
-      </w:tr>
-      <w:tr>
-        <w:trPr>
-          <w:trHeight w:val="300"/>
-        </w:trPr>
-        <w:tc>
-          <w:tcPr>
-            <w:tcW w:w="7190" w:type="dxa"/>
-            <w:gridSpan w:val="4"/>
-            <w:noWrap/>
-          </w:tcPr>
-          <w:p>
-            <w:pPr>
-              <w:rPr>
-                <w:noProof/>
-              </w:rPr>
-            </w:pPr>
-            <w:r>
-              <w:rPr>
-                <w:rFonts w:ascii="Times New Roman" w:hAnsi="Times New Roman" w:cs="Times New Roman"/>
-                <w:bCs/>
-                <w:noProof/>
-                <w:sz w:val="20"/>
-                <w:szCs w:val="20"/>
-              </w:rPr>
-              <w:t>Результат контроля:</w:t>
-            </w:r>
-            <w:r>
-              <w:rPr>
-                <w:noProof/>
-              </w:rPr>
-              <w:t xml:space="preserve"> </w:t>
-            </w:r>
-          </w:p>
-          <w:p>
-            <w:pPr>
-              <w:rPr>
-                <w:rFonts w:ascii="Times New Roman" w:hAnsi="Times New Roman" w:cs="Times New Roman"/>
-                <w:bCs/>
-                <w:noProof/>
-                <w:sz w:val="20"/>
-                <w:szCs w:val="20"/>
-              </w:rPr>
-            </w:pPr>
-          </w:p>
-        </w:tc>
-        <w:tc>
-          <w:tcPr>
-            <w:tcW w:w="1534" w:type="dxa"/>
-            <w:noWrap/>
-            <w:vAlign w:val="center"/>
-          </w:tcPr>
-          <w:p>
-            <w:pPr>
-              <w:jc w:val="center"/>
-              <w:rPr>
-                <w:rFonts w:ascii="Times New Roman" w:hAnsi="Times New Roman" w:cs="Times New Roman"/>
-                <w:bCs/>
-                <w:sz w:val="20"/>
-                <w:szCs w:val="20"/>
-                <w:highlight w:val="yellow"/>
-              </w:rPr>
-            </w:pPr>
-          </w:p>
-        </w:tc>
-        <w:tc>
-          <w:tcPr>
-            <w:tcW w:w="1697" w:type="dxa"/>
-            <w:noWrap/>
-            <w:vAlign w:val="center"/>
-          </w:tcPr>
-          <w:p>
-            <w:pPr>
-              <w:jc w:val="center"/>
-              <w:rPr>
-                <w:rFonts w:ascii="Times New Roman" w:hAnsi="Times New Roman" w:cs="Times New Roman"/>
-                <w:bCs/>
-                <w:sz w:val="20"/>
-                <w:szCs w:val="20"/>
-                <w:highlight w:val="yellow"/>
-              </w:rPr>
-            </w:pPr>
-          </w:p>
-        </w:tc>
-      </w:tr>
-      <w:tr>
-        <w:trPr>
-          <w:trHeight w:val="22"/>
-        </w:trPr>
-        <w:tc>
-          <w:tcPr>
-            <w:tcW w:w="3580" w:type="dxa"/>
-            <w:gridSpan w:val="2"/>
-            <w:noWrap/>
-            <w:vAlign w:val="center"/>
-          </w:tcPr>
-          <w:p>
-            <w:pPr>
-              <w:jc w:val="center"/>
-              <w:rPr>
-                <w:rFonts w:ascii="Times New Roman" w:hAnsi="Times New Roman" w:cs="Times New Roman"/>
-                <w:bCs/>
-                <w:sz w:val="20"/>
-                <w:szCs w:val="20"/>
-                <w:highlight w:val="yellow"/>
-              </w:rPr>
-            </w:pPr>
-            <w:r>
-              <w:rPr>
-                <w:rFonts w:ascii="Times New Roman" w:hAnsi="Times New Roman" w:cs="Times New Roman"/>
-                <w:bCs/>
-                <w:noProof/>
-                <w:sz w:val="20"/>
-                <w:szCs w:val="20"/>
-              </w:rPr>
-              <w:lastRenderedPageBreak/>
-              <w:drawing>
-                <wp:inline distT="0" distB="0" distL="0" distR="0" wp14:anchorId="0F6AAFEA" wp14:editId="5E96C57E">
-                  <wp:extent cx="2210221" cy="1666875"/>
-                  <wp:effectExtent l="0" t="0" r="0" b="0"/>
-                  <wp:docPr id="2" name="Рисунок 2" descr="D:\USER\техресурс\отчеты\16-04-2026_05-53-51\IMG_20260416_075112_848.jpg"/>
-                  <wp:cNvGraphicFramePr>
-                    <a:graphicFrameLocks xmlns:a="http://schemas.openxmlformats.org/drawingml/2006/main" noChangeAspect="1"/>
-                  </wp:cNvGraphicFramePr>
-                  <a:graphic xmlns:a="http://schemas.openxmlformats.org/drawingml/2006/main">
-                    <a:graphicData uri="http://schemas.openxmlformats.org/drawingml/2006/picture">
-                      <pic:pic xmlns:pic="http://schemas.openxmlformats.org/drawingml/2006/picture">
-                        <pic:nvPicPr>
-                          <pic:cNvPr id="0" name="Picture 1" descr="D:\USER\техресурс\отчеты\16-04-2026_05-53-51\IMG_20260416_075112_848.jpg"/>
-                          <pic:cNvPicPr>
-                            <a:picLocks noChangeAspect="1" noChangeArrowheads="1"/>
-                          </pic:cNvPicPr>
-                        </pic:nvPicPr>
-                        <pic:blipFill>
-                          <a:blip r:embed="rId8">
-                            <a:extLst>
-                              <a:ext uri="{28A0092B-C50C-407E-A947-70E740481C1C}">
-                                <a14:useLocalDpi xmlns:a14="http://schemas.microsoft.com/office/drawing/2010/main" val="0"/>
-                              </a:ext>
-                            </a:extLst>
-                          </a:blip>
-                          <a:srcRect/>
-                          <a:stretch>
-                            <a:fillRect/>
-                          </a:stretch>
-                        </pic:blipFill>
-                        <pic:spPr bwMode="auto">
-                          <a:xfrm>
-                            <a:off x="0" y="0"/>
-                            <a:ext cx="2219117" cy="1673584"/>
-                          </a:xfrm>
-                          <a:prstGeom prst="rect">
-                            <a:avLst/>
-                          </a:prstGeom>
-                          <a:noFill/>
-                          <a:ln>
-                            <a:noFill/>
-                          </a:ln>
-                        </pic:spPr>
-                      </pic:pic>
-                    </a:graphicData>
-                  </a:graphic>
-                </wp:inline>
-              </w:drawing>
-            </w:r>
-          </w:p>
-        </w:tc>
-        <w:tc>
-          <w:tcPr>
-            <w:tcW w:w="3610" w:type="dxa"/>
-            <w:gridSpan w:val="2"/>
-            <w:noWrap/>
-            <w:vAlign w:val="center"/>
-          </w:tcPr>
-          <w:p>
-            <w:pPr>
-              <w:jc w:val="center"/>
-              <w:rPr>
-                <w:rFonts w:ascii="Times New Roman" w:hAnsi="Times New Roman" w:cs="Times New Roman"/>
-                <w:bCs/>
-                <w:sz w:val="20"/>
-                <w:szCs w:val="20"/>
-                <w:highlight w:val="yellow"/>
-              </w:rPr>
-            </w:pPr>
-            <w:r>
-              <w:rPr>
-                <w:rFonts w:ascii="Times New Roman" w:hAnsi="Times New Roman" w:cs="Times New Roman"/>
-                <w:bCs/>
-                <w:noProof/>
-                <w:sz w:val="20"/>
-                <w:szCs w:val="20"/>
-              </w:rPr>
-              <w:drawing>
-                <wp:inline distT="0" distB="0" distL="0" distR="0" wp14:anchorId="2F6C904F" wp14:editId="5C3F4EAD">
-                  <wp:extent cx="2209800" cy="1666558"/>
-                  <wp:effectExtent l="0" t="0" r="0" b="0"/>
-                  <wp:docPr id="4" name="Рисунок 4" descr="D:\USER\техресурс\отчеты\16-04-2026_05-53-51\IMG_20260416_075056_240.jpg"/>
-                  <wp:cNvGraphicFramePr>
-                    <a:graphicFrameLocks xmlns:a="http://schemas.openxmlformats.org/drawingml/2006/main" noChangeAspect="1"/>
-                  </wp:cNvGraphicFramePr>
-                  <a:graphic xmlns:a="http://schemas.openxmlformats.org/drawingml/2006/main">
-                    <a:graphicData uri="http://schemas.openxmlformats.org/drawingml/2006/picture">
-                      <pic:pic xmlns:pic="http://schemas.openxmlformats.org/drawingml/2006/picture">
-                        <pic:nvPicPr>
-                          <pic:cNvPr id="0" name="Picture 2" descr="D:\USER\техресурс\отчеты\16-04-2026_05-53-51\IMG_20260416_075056_240.jpg"/>
-                          <pic:cNvPicPr>
-                            <a:picLocks noChangeAspect="1" noChangeArrowheads="1"/>
-                          </pic:cNvPicPr>
-                        </pic:nvPicPr>
-                        <pic:blipFill>
-                          <a:blip r:embed="rId9">
-                            <a:extLst>
-                              <a:ext uri="{28A0092B-C50C-407E-A947-70E740481C1C}">
-                                <a14:useLocalDpi xmlns:a14="http://schemas.microsoft.com/office/drawing/2010/main" val="0"/>
-                              </a:ext>
-                            </a:extLst>
-                          </a:blip>
-                          <a:srcRect/>
-                          <a:stretch>
-                            <a:fillRect/>
-                          </a:stretch>
-                        </pic:blipFill>
-                        <pic:spPr bwMode="auto">
-                          <a:xfrm>
-                            <a:off x="0" y="0"/>
-                            <a:ext cx="2220985" cy="1674994"/>
-                          </a:xfrm>
-                          <a:prstGeom prst="rect">
-                            <a:avLst/>
-                          </a:prstGeom>
-                          <a:noFill/>
-                          <a:ln>
-                            <a:noFill/>
-                          </a:ln>
-                        </pic:spPr>
-                      </pic:pic>
-                    </a:graphicData>
-                  </a:graphic>
-                </wp:inline>
-              </w:drawing>
-            </w:r>
-          </w:p>
-        </w:tc>
-        <w:tc>
-          <w:tcPr>
-            <w:tcW w:w="1534" w:type="dxa"/>
-            <w:noWrap/>
-          </w:tcPr>
-          <w:p>
-            <w:pPr>
-              <w:jc w:val="center"/>
-              <w:rPr>
-                <w:rFonts w:ascii="Times New Roman" w:hAnsi="Times New Roman" w:cs="Times New Roman"/>
-                <w:bCs/>
-                <w:sz w:val="20"/>
-                <w:szCs w:val="20"/>
-                <w:highlight w:val="yellow"/>
-              </w:rPr>
-            </w:pPr>
-          </w:p>
-        </w:tc>
-        <w:tc>
-          <w:tcPr>
-            <w:tcW w:w="1697" w:type="dxa"/>
-            <w:noWrap/>
-          </w:tcPr>
-          <w:p>
-            <w:pPr>
-              <w:jc w:val="center"/>
-              <w:rPr>
-                <w:rFonts w:ascii="Times New Roman" w:hAnsi="Times New Roman" w:cs="Times New Roman"/>
-                <w:bCs/>
-                <w:sz w:val="20"/>
-                <w:szCs w:val="20"/>
-                <w:highlight w:val="yellow"/>
-              </w:rPr>
-            </w:pPr>
-          </w:p>
-        </w:tc>
-      </w:tr>
-      <w:tr>
-        <w:trPr>
-          <w:trHeight w:val="345"/>
-        </w:trPr>
-        <w:tc>
-          <w:tcPr>
-            <w:tcW w:w="10421" w:type="dxa"/>
-            <w:gridSpan w:val="6"/>
-            <w:vAlign w:val="center"/>
-            <w:hideMark/>
-          </w:tcPr>
-          <w:p>
-            <w:pPr>
-              <w:jc w:val="center"/>
-              <w:rPr>
-                <w:rFonts w:ascii="Times New Roman" w:hAnsi="Times New Roman" w:cs="Times New Roman"/>
-                <w:b/>
-                <w:bCs/>
-                <w:sz w:val="20"/>
-                <w:szCs w:val="20"/>
-              </w:rPr>
-            </w:pPr>
-            <w:r>
-              <w:rPr>
-                <w:rFonts w:ascii="Times New Roman" w:hAnsi="Times New Roman" w:cs="Times New Roman"/>
-                <w:b/>
-                <w:bCs/>
-                <w:sz w:val="20"/>
-                <w:szCs w:val="20"/>
-              </w:rPr>
-              <w:t>Выявленные замечания с внесением фотоматериалов в отчет</w:t>
-            </w:r>
-          </w:p>
-        </w:tc>
-      </w:tr>
-      <w:tr>
-        <w:trPr>
-          <w:trHeight w:val="345"/>
-        </w:trPr>
-        <w:tc>
-          <w:tcPr>
-            <w:tcW w:w="10421" w:type="dxa"/>
-            <w:gridSpan w:val="6"/>
-            <w:tcBorders>
-              <w:bottom w:val="threeDEmboss" w:sz="12" w:space="0" w:color="auto"/>
-            </w:tcBorders>
-            <w:noWrap/>
-            <w:vAlign w:val="center"/>
-          </w:tcPr>
-          <w:p>
-            <w:pPr>
-              <w:rPr>
-                <w:rFonts w:ascii="Times New Roman" w:hAnsi="Times New Roman" w:cs="Times New Roman"/>
-                <w:bCs/>
-                <w:sz w:val="20"/>
-                <w:szCs w:val="20"/>
-                <w:highlight w:val="yellow"/>
-              </w:rPr>
-            </w:pPr>
-          </w:p>
-        </w:tc>
-      </w:tr>
-      <w:tr>
-        <w:trPr>
-          <w:trHeight w:val="299"/>
-        </w:trPr>
-        <w:tc>
-          <w:tcPr>
-            <w:tcW w:w="3580" w:type="dxa"/>
-            <w:gridSpan w:val="2"/>
-            <w:tcBorders>
-              <w:right w:val="threeDEmboss" w:sz="12" w:space="0" w:color="auto"/>
-            </w:tcBorders>
-            <w:noWrap/>
-            <w:vAlign w:val="center"/>
-          </w:tcPr>
-          <w:p>
-            <w:pPr>
-              <w:jc w:val="center"/>
-              <w:rPr>
-                <w:rFonts w:ascii="Times New Roman" w:hAnsi="Times New Roman" w:cs="Times New Roman"/>
-                <w:bCs/>
-                <w:sz w:val="20"/>
-                <w:szCs w:val="20"/>
-                <w:highlight w:val="yellow"/>
-              </w:rPr>
-            </w:pPr>
-          </w:p>
-        </w:tc>
-        <w:tc>
-          <w:tcPr>
-            <w:tcW w:w="3610" w:type="dxa"/>
-            <w:gridSpan w:val="2"/>
-            <w:tcBorders>
-              <w:left w:val="threeDEmboss" w:sz="12" w:space="0" w:color="auto"/>
-              <w:right w:val="threeDEmboss" w:sz="12" w:space="0" w:color="auto"/>
-            </w:tcBorders>
-            <w:vAlign w:val="center"/>
-          </w:tcPr>
-          <w:p>
-            <w:pPr>
-              <w:jc w:val="center"/>
-              <w:rPr>
-                <w:rFonts w:ascii="Times New Roman" w:hAnsi="Times New Roman" w:cs="Times New Roman"/>
-                <w:bCs/>
-                <w:sz w:val="20"/>
-                <w:szCs w:val="20"/>
-                <w:highlight w:val="yellow"/>
-              </w:rPr>
-            </w:pPr>
-          </w:p>
-        </w:tc>
-        <w:tc>
-          <w:tcPr>
-            <w:tcW w:w="3231" w:type="dxa"/>
-            <w:gridSpan w:val="2"/>
-            <w:tcBorders>
-              <w:left w:val="threeDEmboss" w:sz="12" w:space="0" w:color="auto"/>
-            </w:tcBorders>
-            <w:vAlign w:val="center"/>
-          </w:tcPr>
-          <w:p>
-            <w:pPr>
-              <w:jc w:val="center"/>
-              <w:rPr>
-                <w:rFonts w:ascii="Times New Roman" w:hAnsi="Times New Roman" w:cs="Times New Roman"/>
-                <w:bCs/>
-                <w:sz w:val="20"/>
-                <w:szCs w:val="20"/>
-                <w:highlight w:val="yellow"/>
-              </w:rPr>
-            </w:pPr>
-          </w:p>
-        </w:tc>
-      </w:tr>
-      <w:tr>
-        <w:trPr>
-          <w:trHeight w:val="300"/>
-        </w:trPr>
-        <w:tc>
-          <w:tcPr>
-            <w:tcW w:w="10421" w:type="dxa"/>
-            <w:gridSpan w:val="6"/>
-            <w:tcBorders>
-              <w:bottom w:val="threeDEmboss" w:sz="12" w:space="0" w:color="auto"/>
-            </w:tcBorders>
-            <w:hideMark/>
-          </w:tcPr>
-          <w:p>
-            <w:pPr>
-              <w:jc w:val="center"/>
-              <w:rPr>
-                <w:rFonts w:ascii="Times New Roman" w:hAnsi="Times New Roman" w:cs="Times New Roman"/>
-                <w:b/>
-                <w:bCs/>
-                <w:sz w:val="20"/>
-                <w:szCs w:val="20"/>
-              </w:rPr>
-            </w:pPr>
-            <w:r>
-              <w:rPr>
-                <w:rFonts w:ascii="Times New Roman" w:hAnsi="Times New Roman" w:cs="Times New Roman"/>
-                <w:b/>
-                <w:bCs/>
-                <w:sz w:val="20"/>
-                <w:szCs w:val="20"/>
-              </w:rPr>
-              <w:t>Замечания по ПЭБ, ОТ и ГЗ с внесением фотоматериалов в отчет</w:t>
-            </w:r>
-          </w:p>
-        </w:tc>
-      </w:tr>
-      <w:tr>
-        <w:trPr>
-          <w:trHeight w:val="300"/>
-        </w:trPr>
-        <w:tc>
-          <w:tcPr>
-            <w:tcW w:w="10421" w:type="dxa"/>
-            <w:gridSpan w:val="6"/>
-            <w:tcBorders>
-              <w:bottom w:val="threeDEmboss" w:sz="12" w:space="0" w:color="auto"/>
-            </w:tcBorders>
-          </w:tcPr>
-          <w:p>
-            <w:pPr>
-              <w:rPr>
-                <w:rFonts w:ascii="Times New Roman" w:hAnsi="Times New Roman" w:cs="Times New Roman"/>
-                <w:sz w:val="20"/>
-                <w:szCs w:val="20"/>
-              </w:rPr>
-            </w:pPr>
-          </w:p>
-        </w:tc>
-      </w:tr>
-      <w:tr>
-        <w:trPr>
-          <w:trHeight w:val="300"/>
-        </w:trPr>
-        <w:tc>
-          <w:tcPr>
-            <w:tcW w:w="3580" w:type="dxa"/>
-            <w:gridSpan w:val="2"/>
-            <w:tcBorders>
-              <w:right w:val="threeDEmboss" w:sz="12" w:space="0" w:color="auto"/>
-            </w:tcBorders>
-            <w:noWrap/>
-            <w:vAlign w:val="center"/>
-          </w:tcPr>
-          <w:p>
-            <w:pPr>
-              <w:jc w:val="center"/>
-              <w:rPr>
-                <w:rFonts w:ascii="Times New Roman" w:hAnsi="Times New Roman" w:cs="Times New Roman"/>
-                <w:bCs/>
-                <w:color w:val="FF0000"/>
-                <w:sz w:val="20"/>
-                <w:szCs w:val="20"/>
-              </w:rPr>
-            </w:pPr>
-          </w:p>
-        </w:tc>
-        <w:tc>
-          <w:tcPr>
-            <w:tcW w:w="3610" w:type="dxa"/>
-            <w:gridSpan w:val="2"/>
-            <w:tcBorders>
-              <w:left w:val="threeDEmboss" w:sz="12" w:space="0" w:color="auto"/>
-              <w:right w:val="threeDEmboss" w:sz="12" w:space="0" w:color="auto"/>
-            </w:tcBorders>
-            <w:vAlign w:val="center"/>
-          </w:tcPr>
-          <w:p>
-            <w:pPr>
-              <w:jc w:val="center"/>
-              <w:rPr>
-                <w:rFonts w:ascii="Times New Roman" w:hAnsi="Times New Roman" w:cs="Times New Roman"/>
-                <w:bCs/>
-                <w:color w:val="FF0000"/>
-                <w:sz w:val="20"/>
-                <w:szCs w:val="20"/>
-              </w:rPr>
-            </w:pPr>
-          </w:p>
-        </w:tc>
-        <w:tc>
-          <w:tcPr>
-            <w:tcW w:w="3231" w:type="dxa"/>
-            <w:gridSpan w:val="2"/>
-            <w:tcBorders>
-              <w:left w:val="threeDEmboss" w:sz="12" w:space="0" w:color="auto"/>
-            </w:tcBorders>
-          </w:tcPr>
-          <w:p>
-            <w:pPr>
-              <w:rPr>
-                <w:rFonts w:ascii="Times New Roman" w:hAnsi="Times New Roman" w:cs="Times New Roman"/>
-                <w:bCs/>
-                <w:color w:val="FF0000"/>
-                <w:sz w:val="20"/>
-                <w:szCs w:val="20"/>
-              </w:rPr>
-            </w:pPr>
-          </w:p>
-        </w:tc>
-      </w:tr>
-      <w:tr>
-        <w:trPr>
-          <w:trHeight w:val="346"/>
-        </w:trPr>
-        <w:tc>
-          <w:tcPr>
-            <w:tcW w:w="3580" w:type="dxa"/>
-            <w:gridSpan w:val="2"/>
-            <w:noWrap/>
-            <w:vAlign w:val="center"/>
-            <w:hideMark/>
-          </w:tcPr>
-          <w:p>
-            <w:pPr>
-              <w:rPr>
-                <w:rFonts w:ascii="Times New Roman" w:hAnsi="Times New Roman" w:cs="Times New Roman"/>
-                <w:b/>
-                <w:sz w:val="20"/>
-                <w:szCs w:val="20"/>
-              </w:rPr>
-            </w:pPr>
-            <w:r>
-              <w:rPr>
-                <w:rFonts w:ascii="Times New Roman" w:hAnsi="Times New Roman" w:cs="Times New Roman"/>
-                <w:b/>
-                <w:sz w:val="20"/>
-                <w:szCs w:val="20"/>
-              </w:rPr>
-              <w:t>Рекомендуемые действия:</w:t>
-            </w:r>
-          </w:p>
-        </w:tc>
-        <w:tc>
-          <w:tcPr>
-            <w:tcW w:w="6841" w:type="dxa"/>
-            <w:gridSpan w:val="4"/>
-            <w:vAlign w:val="center"/>
-          </w:tcPr>
-          <w:p>
-            <w:pPr>
-              <w:rPr>
-                <w:rFonts w:ascii="Times New Roman" w:hAnsi="Times New Roman" w:cs="Times New Roman"/>
-                <w:bCs/>
-                <w:sz w:val="20"/>
-                <w:szCs w:val="20"/>
-              </w:rPr>
-            </w:pPr>
-            <w:r>
-              <w:rPr>
-                <w:rFonts w:ascii="Times New Roman" w:hAnsi="Times New Roman" w:cs="Times New Roman"/>
-                <w:bCs/>
-                <w:sz w:val="20"/>
-                <w:szCs w:val="20"/>
-              </w:rPr>
-              <w:t>нет</w:t>
-            </w:r>
-          </w:p>
-        </w:tc>
-      </w:tr>
-      <w:tr>
-        <w:trPr>
-          <w:trHeight w:val="346"/>
-        </w:trPr>
-        <w:tc>
-          <w:tcPr>
-            <w:tcW w:w="3580" w:type="dxa"/>
-            <w:gridSpan w:val="2"/>
-            <w:vAlign w:val="center"/>
-            <w:hideMark/>
-          </w:tcPr>
-          <w:p>
-            <w:pPr>
-              <w:rPr>
-                <w:rFonts w:ascii="Times New Roman" w:hAnsi="Times New Roman" w:cs="Times New Roman"/>
-                <w:b/>
-                <w:sz w:val="20"/>
-                <w:szCs w:val="20"/>
-              </w:rPr>
-            </w:pPr>
-            <w:r>
-              <w:rPr>
-                <w:rFonts w:ascii="Times New Roman" w:hAnsi="Times New Roman" w:cs="Times New Roman"/>
-                <w:b/>
-                <w:sz w:val="20"/>
-                <w:szCs w:val="20"/>
-              </w:rPr>
-              <w:t>Для информации:</w:t>
-            </w:r>
-          </w:p>
-        </w:tc>
-        <w:tc>
-          <w:tcPr>
-            <w:tcW w:w="6841" w:type="dxa"/>
-            <w:gridSpan w:val="4"/>
-            <w:vAlign w:val="center"/>
-          </w:tcPr>
-          <w:p>
-            <w:pPr>
-              <w:rPr>
-                <w:rFonts w:ascii="Times New Roman" w:hAnsi="Times New Roman" w:cs="Times New Roman"/>
-                <w:bCs/>
-                <w:sz w:val="20"/>
-                <w:szCs w:val="20"/>
-              </w:rPr>
-            </w:pPr>
-            <w:r>
-              <w:rPr>
-                <w:rFonts w:ascii="Times New Roman" w:hAnsi="Times New Roman" w:cs="Times New Roman"/>
-                <w:bCs/>
-                <w:sz w:val="20"/>
-                <w:szCs w:val="20"/>
-              </w:rPr>
-              <w:t>нет</w:t>
-            </w:r>
-          </w:p>
-        </w:tc>
-      </w:tr>
-      <w:tr>
-        <w:trPr>
-          <w:trHeight w:val="346"/>
-        </w:trPr>
-        <w:tc>
-          <w:tcPr>
-            <w:tcW w:w="3580" w:type="dxa"/>
-            <w:gridSpan w:val="2"/>
-            <w:vAlign w:val="center"/>
-            <w:hideMark/>
-          </w:tcPr>
-          <w:p>
-            <w:pPr>
-              <w:rPr>
-                <w:rFonts w:ascii="Times New Roman" w:hAnsi="Times New Roman" w:cs="Times New Roman"/>
-                <w:b/>
-                <w:bCs/>
-                <w:sz w:val="20"/>
-                <w:szCs w:val="20"/>
-              </w:rPr>
-            </w:pPr>
-            <w:r>
-              <w:rPr>
-                <w:rFonts w:ascii="Times New Roman" w:hAnsi="Times New Roman" w:cs="Times New Roman"/>
-                <w:b/>
-                <w:bCs/>
-                <w:sz w:val="20"/>
-                <w:szCs w:val="20"/>
-              </w:rPr>
-              <w:t>ВЫВОД:</w:t>
-            </w:r>
-          </w:p>
-        </w:tc>
-        <w:tc>
-          <w:tcPr>
-            <w:tcW w:w="6841" w:type="dxa"/>
-            <w:gridSpan w:val="4"/>
-            <w:vAlign w:val="center"/>
-          </w:tcPr>
-          <w:p>
-            <w:pPr>
-              <w:rPr>
-                <w:rFonts w:ascii="Times New Roman" w:hAnsi="Times New Roman" w:cs="Times New Roman"/>
-                <w:bCs/>
-                <w:sz w:val="20"/>
-                <w:szCs w:val="20"/>
-              </w:rPr>
-            </w:pPr>
-            <w:r>
-              <w:rPr>
-                <w:rFonts w:ascii="Times New Roman" w:hAnsi="Times New Roman" w:cs="Times New Roman"/>
-                <w:bCs/>
-                <w:sz w:val="20"/>
-                <w:szCs w:val="20"/>
-              </w:rPr>
-              <w:t>Работы ведутся в соответствии с проектом</w:t>
-            </w:r>
-          </w:p>
-        </w:tc>
-      </w:tr>
-      <w:tr>
-        <w:trPr>
-          <w:trHeight w:val="289"/>
-        </w:trPr>
-        <w:tc>
-          <w:tcPr>
-            <w:tcW w:w="3580" w:type="dxa"/>
-            <w:gridSpan w:val="2"/>
-            <w:vAlign w:val="center"/>
-            <w:hideMark/>
-          </w:tcPr>
-          <w:p>
-            <w:pPr>
-              <w:jc w:val="center"/>
-              <w:rPr>
-                <w:rFonts w:ascii="Times New Roman" w:hAnsi="Times New Roman" w:cs="Times New Roman"/>
-                <w:b/>
-                <w:sz w:val="20"/>
-                <w:szCs w:val="20"/>
-              </w:rPr>
-            </w:pPr>
-            <w:r>
-              <w:rPr>
-                <w:rFonts w:ascii="Times New Roman" w:hAnsi="Times New Roman" w:cs="Times New Roman"/>
-                <w:b/>
-                <w:sz w:val="20"/>
-                <w:szCs w:val="20"/>
-              </w:rPr>
-              <w:t>Инженер СК</w:t>
-            </w:r>
-          </w:p>
-        </w:tc>
-        <w:tc>
-          <w:tcPr>
-            <w:tcW w:w="3610" w:type="dxa"/>
-            <w:gridSpan w:val="2"/>
-            <w:vMerge w:val="restart"/>
-            <w:hideMark/>
-          </w:tcPr>
-          <w:p>
-            <w:pPr>
-              <w:jc w:val="center"/>
-              <w:rPr>
-                <w:rFonts w:ascii="Times New Roman" w:hAnsi="Times New Roman" w:cs="Times New Roman"/>
-                <w:b/>
-                <w:sz w:val="20"/>
-                <w:szCs w:val="20"/>
-              </w:rPr>
-            </w:pPr>
-            <w:r>
-              <w:rPr>
-                <w:rFonts w:ascii="Times New Roman" w:hAnsi="Times New Roman" w:cs="Times New Roman"/>
-                <w:b/>
-                <w:noProof/>
-                <w:sz w:val="20"/>
-                <w:szCs w:val="20"/>
-              </w:rPr>
-              <w:drawing>
-                <wp:anchor distT="0" distB="0" distL="114300" distR="114300" simplePos="0" relativeHeight="251660288" behindDoc="1" locked="0" layoutInCell="1" allowOverlap="1" wp14:anchorId="605711AC" wp14:editId="564ACA1D">
-                  <wp:simplePos x="0" y="0"/>
-                  <wp:positionH relativeFrom="column">
-                    <wp:posOffset>740410</wp:posOffset>
-                  </wp:positionH>
-                  <wp:positionV relativeFrom="paragraph">
-                    <wp:posOffset>105410</wp:posOffset>
-                  </wp:positionV>
-                  <wp:extent cx="863266" cy="387985"/>
-                  <wp:effectExtent l="0" t="0" r="0" b="0"/>
-                  <wp:wrapNone/>
-                  <wp:docPr id="1" name="Рисунок 1" descr="D:\USER\техресурс\отчеты\подпись.jpg"/>
-                  <wp:cNvGraphicFramePr>
-                    <a:graphicFrameLocks xmlns:a="http://schemas.openxmlformats.org/drawingml/2006/main" noChangeAspect="1"/>
-                  </wp:cNvGraphicFramePr>
-                  <a:graphic xmlns:a="http://schemas.openxmlformats.org/drawingml/2006/main">
-                    <a:graphicData uri="http://schemas.openxmlformats.org/drawingml/2006/picture">
-                      <pic:pic xmlns:pic="http://schemas.openxmlformats.org/drawingml/2006/picture">
-                        <pic:nvPicPr>
-                          <pic:cNvPr id="0" name="Picture 1" descr="D:\USER\техресурс\отчеты\подпись.jpg"/>
-                          <pic:cNvPicPr>
-                            <a:picLocks noChangeAspect="1" noChangeArrowheads="1"/>
-                          </pic:cNvPicPr>
-                        </pic:nvPicPr>
-                        <pic:blipFill>
-                          <a:blip r:embed="rId10" cstate="print">
-                            <a:extLst>
-                              <a:ext uri="{28A0092B-C50C-407E-A947-70E740481C1C}">
-                                <a14:useLocalDpi xmlns:a14="http://schemas.microsoft.com/office/drawing/2010/main" val="0"/>
-                              </a:ext>
-                            </a:extLst>
-                          </a:blip>
-                          <a:srcRect/>
-                          <a:stretch>
-                            <a:fillRect/>
-                          </a:stretch>
-                        </pic:blipFill>
-                        <pic:spPr bwMode="auto">
-                          <a:xfrm>
-                            <a:off x="0" y="0"/>
-                            <a:ext cx="863266" cy="387985"/>
-                          </a:xfrm>
-                          <a:prstGeom prst="rect">
-                            <a:avLst/>
-                          </a:prstGeom>
-                          <a:noFill/>
-                          <a:ln>
-                            <a:noFill/>
-                          </a:ln>
-                        </pic:spPr>
-                      </pic:pic>
-                    </a:graphicData>
-                  </a:graphic>
-                  <wp14:sizeRelH relativeFrom="margin">
-                    <wp14:pctWidth>0</wp14:pctWidth>
-                  </wp14:sizeRelH>
-                  <wp14:sizeRelV relativeFrom="margin">
-                    <wp14:pctHeight>0</wp14:pctHeight>
-                  </wp14:sizeRelV>
-                </wp:anchor>
-              </w:drawing>
-            </w:r>
-          </w:p>
-        </w:tc>
-        <w:tc>
-          <w:tcPr>
-            <w:tcW w:w="3231" w:type="dxa"/>
-            <w:gridSpan w:val="2"/>
-            <w:hideMark/>
-          </w:tcPr>
-          <w:p>
-            <w:pPr>
-              <w:jc w:val="center"/>
-              <w:rPr>
-                <w:rFonts w:ascii="Times New Roman" w:hAnsi="Times New Roman" w:cs="Times New Roman"/>
-                <w:bCs/>
-                <w:sz w:val="20"/>
-                <w:szCs w:val="20"/>
-              </w:rPr>
-            </w:pPr>
-            <w:r>
-              <w:t>Руководитель проекта СК</w:t>
-            </w:r>
-          </w:p>
-        </w:tc>
-      </w:tr>
-      <w:tr>
-        <w:trPr>
-          <w:trHeight w:val="351"/>
-        </w:trPr>
-        <w:tc>
-          <w:tcPr>
-            <w:tcW w:w="3580" w:type="dxa"/>
-            <w:gridSpan w:val="2"/>
-            <w:vAlign w:val="center"/>
-          </w:tcPr>
-          <w:p>
-            <w:pPr>
-              <w:jc w:val="center"/>
-              <w:rPr>
-                <w:rFonts w:ascii="Times New Roman" w:hAnsi="Times New Roman" w:cs="Times New Roman"/>
-                <w:bCs/>
-                <w:sz w:val="20"/>
-                <w:szCs w:val="20"/>
-              </w:rPr>
-            </w:pPr>
-            <w:r>
-              <w:rPr>
-                <w:rFonts w:ascii="Times New Roman" w:hAnsi="Times New Roman" w:cs="Times New Roman"/>
-                <w:bCs/>
-                <w:sz w:val="20"/>
-                <w:szCs w:val="20"/>
-              </w:rPr>
-              <w:t>Бадаев Валентин Борисович</w:t>
-            </w:r>
-          </w:p>
-        </w:tc>
-        <w:tc>
-          <w:tcPr>
-            <w:tcW w:w="3610" w:type="dxa"/>
-            <w:gridSpan w:val="2"/>
-            <w:vMerge/>
-            <w:hideMark/>
-          </w:tcPr>
-          <w:p>
-            <w:pPr>
-              <w:jc w:val="center"/>
-              <w:rPr>
-                <w:rFonts w:ascii="Times New Roman" w:hAnsi="Times New Roman" w:cs="Times New Roman"/>
-                <w:b/>
-                <w:sz w:val="20"/>
-                <w:szCs w:val="20"/>
-              </w:rPr>
-            </w:pPr>
-          </w:p>
-        </w:tc>
-        <w:tc>
-          <w:tcPr>
-            <w:tcW w:w="3231" w:type="dxa"/>
-            <w:gridSpan w:val="2"/>
-            <w:hideMark/>
-          </w:tcPr>
-          <w:p>
-            <w:pPr>
-              <w:jc w:val="center"/>
-              <w:rPr>
-                <w:rFonts w:ascii="Times New Roman" w:hAnsi="Times New Roman" w:cs="Times New Roman"/>
-                <w:bCs/>
-                <w:sz w:val="20"/>
-                <w:szCs w:val="20"/>
-              </w:rPr>
-            </w:pPr>
-            <w:r>
-              <w:t>Аниськов Владимир Иванович</w:t>
-            </w:r>
-          </w:p>
-        </w:tc>
-      </w:tr>
-      <w:tr>
-        <w:trPr>
-          <w:trHeight w:val="345"/>
-        </w:trPr>
-        <w:tc>
-          <w:tcPr>
-            <w:tcW w:w="3580" w:type="dxa"/>
-            <w:gridSpan w:val="2"/>
-            <w:vAlign w:val="center"/>
-          </w:tcPr>
-          <w:p>
-            <w:pPr>
-              <w:jc w:val="center"/>
-              <w:rPr>
-                <w:rFonts w:ascii="Times New Roman" w:hAnsi="Times New Roman" w:cs="Times New Roman"/>
-                <w:bCs/>
-                <w:sz w:val="20"/>
-                <w:szCs w:val="20"/>
-              </w:rPr>
-            </w:pPr>
-            <w:r>
-              <w:rPr>
-                <w:rFonts w:ascii="Times New Roman" w:hAnsi="Times New Roman" w:cs="Times New Roman"/>
-                <w:bCs/>
-                <w:sz w:val="20"/>
-                <w:szCs w:val="20"/>
-              </w:rPr>
-              <w:t>89869053369</w:t>
-            </w:r>
-          </w:p>
-        </w:tc>
-        <w:tc>
-          <w:tcPr>
-            <w:tcW w:w="3610" w:type="dxa"/>
-            <w:gridSpan w:val="2"/>
-            <w:noWrap/>
-            <w:hideMark/>
-          </w:tcPr>
-          <w:p>
-            <w:pPr>
-              <w:jc w:val="center"/>
-              <w:rPr>
-                <w:rFonts w:ascii="Times New Roman" w:hAnsi="Times New Roman" w:cs="Times New Roman"/>
-                <w:b/>
-                <w:sz w:val="20"/>
-                <w:szCs w:val="20"/>
-              </w:rPr>
-            </w:pPr>
-            <w:r>
-              <w:rPr>
-                <w:rFonts w:ascii="Times New Roman" w:hAnsi="Times New Roman" w:cs="Times New Roman"/>
-                <w:b/>
-                <w:sz w:val="20"/>
-                <w:szCs w:val="20"/>
-              </w:rPr>
-              <w:t>подпись</w:t>
-            </w:r>
-          </w:p>
-        </w:tc>
-        <w:tc>
-          <w:tcPr>
-            <w:tcW w:w="3231" w:type="dxa"/>
-            <w:gridSpan w:val="2"/>
-            <w:hideMark/>
-          </w:tcPr>
-          <w:p>
-            <w:pPr>
-              <w:jc w:val="center"/>
-              <w:rPr>
-                <w:rFonts w:ascii="Times New Roman" w:hAnsi="Times New Roman" w:cs="Times New Roman"/>
-                <w:bCs/>
-                <w:sz w:val="20"/>
-                <w:szCs w:val="20"/>
-              </w:rPr>
-            </w:pPr>
-            <w:r>
-              <w:t>89323205078</w:t>
-            </w:r>
-          </w:p>
-        </w:tc>
-      </w:tr>
-    </w:tbl>
     <w:p>
       <w:pPr>
         <w:spacing w:after="0" w:line="240" w:lineRule="auto"/>
@@ -3832,11 +13,106 @@
           <w:szCs w:val="20"/>
         </w:rPr>
       </w:pPr>
+      <w:r>
+        <w:rPr>
+          <w:rFonts w:ascii="Times New Roman" w:hAnsi="Times New Roman" w:cs="Times New Roman"/>
+          <w:b/>
+          <w:sz w:val="20"/>
+          <w:szCs w:val="20"/>
+        </w:rPr>
+        <w:t xml:space="preserve">Отчёт строительного контроля по </w:t>
+      </w:r>
+      <w:r>
+        <w:rPr>
+          <w:rFonts w:ascii="Times New Roman" w:hAnsi="Times New Roman" w:cs="Times New Roman"/>
+          <w:b/>
+          <w:sz w:val="20"/>
+          <w:szCs w:val="20"/>
+        </w:rPr>
+        <w:t>Геодезическ</w:t>
+      </w:r>
+      <w:r>
+        <w:rPr>
+          <w:rFonts w:ascii="Times New Roman" w:hAnsi="Times New Roman" w:cs="Times New Roman"/>
+          <w:b/>
+          <w:sz w:val="20"/>
+          <w:szCs w:val="20"/>
+        </w:rPr>
+        <w:t>ому</w:t>
+      </w:r>
+      <w:r>
+        <w:rPr>
+          <w:rFonts w:ascii="Times New Roman" w:hAnsi="Times New Roman" w:cs="Times New Roman"/>
+          <w:b/>
+          <w:sz w:val="20"/>
+          <w:szCs w:val="20"/>
+        </w:rPr>
+        <w:t xml:space="preserve"> контрол</w:t>
+      </w:r>
+      <w:r>
+        <w:rPr>
+          <w:rFonts w:ascii="Times New Roman" w:hAnsi="Times New Roman" w:cs="Times New Roman"/>
+          <w:b/>
+          <w:sz w:val="20"/>
+          <w:szCs w:val="20"/>
+        </w:rPr>
+        <w:t>ю</w:t>
+      </w:r>
+      <w:bookmarkStart w:id="0" w:name="_GoBack"/>
+      <w:bookmarkEnd w:id="0"/>
+      <w:r>
+        <w:rPr>
+          <w:rFonts w:ascii="Times New Roman" w:hAnsi="Times New Roman"/>
+          <w:b/>
+          <w:sz w:val="20"/>
+          <w:szCs w:val="20"/>
+        </w:rPr>
+        <w:t xml:space="preserve"> </w:t>
+      </w:r>
+      <w:r>
+        <w:rPr>
+          <w:rFonts w:ascii="Times New Roman" w:hAnsi="Times New Roman" w:cs="Times New Roman"/>
+          <w:b/>
+          <w:sz w:val="20"/>
+          <w:szCs w:val="20"/>
+        </w:rPr>
+        <w:t>за</w:t>
+      </w:r>
+      <w:r>
+        <w:rPr>
+          <w:rFonts w:ascii="Times New Roman" w:hAnsi="Times New Roman" w:cs="Times New Roman"/>
+          <w:b/>
+          <w:sz w:val="20"/>
+          <w:szCs w:val="20"/>
+        </w:rPr>
+        <w:t xml:space="preserve"> </w:t>
+      </w:r>
+      <w:r>
+        <w:rPr>
+          <w:rFonts w:ascii="Times New Roman" w:hAnsi="Times New Roman" w:cs="Times New Roman"/>
+          <w:b/>
+          <w:sz w:val="20"/>
+          <w:szCs w:val="20"/>
+        </w:rPr>
+        <w:t>02.08.2025г</w:t>
+      </w:r>
+    </w:p>
+    <w:p>
+      <w:pPr>
+        <w:spacing w:after="0" w:line="240" w:lineRule="auto"/>
+        <w:jc w:val="center"/>
+        <w:rPr>
+          <w:rFonts w:ascii="Times New Roman" w:hAnsi="Times New Roman" w:cs="Times New Roman"/>
+          <w:bCs/>
+          <w:sz w:val="20"/>
+          <w:szCs w:val="20"/>
+        </w:rPr>
+      </w:pPr>
     </w:p>
     <w:sectPr>
-      <w:headerReference w:type="default" r:id="rId11"/>
+      <w:headerReference w:type="default" r:id="rId8"/>
       <w:pgSz w:w="11906" w:h="16838"/>
-      <w:pgMar w:top="284" w:right="567" w:bottom="567" w:left="1134" w:header="284" w:footer="709" w:gutter="0"/>
+      <w:pgMar w:top="1843" w:right="567" w:bottom="567" w:left="1134" w:header="284" w:footer="709" w:gutter="0"/>
       <w:cols w:space="708"/>
       <w:docGrid w:linePitch="360"/>
     </w:sectPr>
@@ -3845,7 +121,7 @@
 </file>
 
 <file path=word/endnotes.xml><?xml version="1.0" encoding="utf-8"?>
-<w:endnotes xmlns:wpc="http://schemas.microsoft.com/office/word/2010/wordprocessingCanvas" xmlns:cx="http://schemas.microsoft.com/office/drawing/2014/chartex" xmlns:cx1="http://schemas.microsoft.com/office/drawing/2015/9/8/chartex" xmlns:mc="http://schemas.openxmlformats.org/markup-compatibility/2006" xmlns:o="urn:schemas-microsoft-com:office:office" xmlns:r="http://schemas.openxmlformats.org/officeDocument/2006/relationships" xmlns:m="http://schemas.openxmlformats.org/officeDocument/2006/math" xmlns:v="urn:schemas-microsoft-com:vml" xmlns:wp14="http://schemas.microsoft.com/office/word/2010/wordprocessingDrawing" xmlns:wp="http://schemas.openxmlformats.org/drawingml/2006/wordprocessingDrawing" xmlns:w10="urn:schemas-microsoft-com:office:word" xmlns:w="http://schemas.openxmlformats.org/wordprocessingml/2006/main" xmlns:w14="http://schemas.microsoft.com/office/word/2010/wordml" xmlns:w15="http://schemas.microsoft.com/office/word/2012/wordml" xmlns:w16se="http://schemas.microsoft.com/office/word/2015/wordml/symex" xmlns:wpg="http://schemas.microsoft.com/office/word/2010/wordprocessingGroup" xmlns:wpi="http://schemas.microsoft.com/office/word/2010/wordprocessingInk" xmlns:wne="http://schemas.microsoft.com/office/word/2006/wordml" xmlns:wps="http://schemas.microsoft.com/office/word/2010/wordprocessingShape" mc:Ignorable="w14 w15 w16se wp14">
+<w:endnotes xmlns:wpc="http://schemas.microsoft.com/office/word/2010/wordprocessingCanvas" xmlns:cx="http://schemas.microsoft.com/office/drawing/2014/chartex" xmlns:cx1="http://schemas.microsoft.com/office/drawing/2015/9/8/chartex" xmlns:cx2="http://schemas.microsoft.com/office/drawing/2015/10/21/chartex" xmlns:cx3="http://schemas.microsoft.com/office/drawing/2016/5/9/chartex" xmlns:cx4="http://schemas.microsoft.com/office/drawing/2016/5/10/chartex" xmlns:cx5="http://schemas.microsoft.com/office/drawing/2016/5/11/chartex" xmlns:cx6="http://schemas.microsoft.com/office/drawing/2016/5/12/chartex" xmlns:cx7="http://schemas.microsoft.com/office/drawing/2016/5/13/chartex" xmlns:cx8="http://schemas.microsoft.com/office/drawing/2016/5/14/chartex" xmlns:mc="http://schemas.openxmlformats.org/markup-compatibility/2006" xmlns:aink="http://schemas.microsoft.com/office/drawing/2016/ink" xmlns:am3d="http://schemas.microsoft.com/office/drawing/2017/model3d" xmlns:o="urn:schemas-microsoft-com:office:office" xmlns:r="http://schemas.openxmlformats.org/officeDocument/2006/relationships" xmlns:m="http://schemas.openxmlformats.org/officeDocument/2006/math" xmlns:v="urn:schemas-microsoft-com:vml" xmlns:wp14="http://schemas.microsoft.com/office/word/2010/wordprocessingDrawing" xmlns:wp="http://schemas.openxmlformats.org/drawingml/2006/wordprocessingDrawing" xmlns:w10="urn:schemas-microsoft-com:office:word" xmlns:w="http://schemas.openxmlformats.org/wordprocessingml/2006/main" xmlns:w14="http://schemas.microsoft.com/office/word/2010/wordml" xmlns:w15="http://schemas.microsoft.com/office/word/2012/wordml" xmlns:w16cex="http://schemas.microsoft.com/office/word/2018/wordml/cex" xmlns:w16cid="http://schemas.microsoft.com/office/word/2016/wordml/cid" xmlns:w16="http://schemas.microsoft.com/office/word/2018/wordml" xmlns:w16se="http://schemas.microsoft.com/office/word/2015/wordml/symex" xmlns:wpg="http://schemas.microsoft.com/office/word/2010/wordprocessingGroup" xmlns:wpi="http://schemas.microsoft.com/office/word/2010/wordprocessingInk" xmlns:wne="http://schemas.microsoft.com/office/word/2006/wordml" xmlns:wps="http://schemas.microsoft.com/office/word/2010/wordprocessingShape" mc:Ignorable="w14 w15 w16se w16cid w16 w16cex wp14">
   <w:endnote w:type="separator" w:id="-1">
     <w:p>
       <w:pPr>
@@ -3870,7 +146,7 @@
 </file>
 
 <file path=word/footnotes.xml><?xml version="1.0" encoding="utf-8"?>
-<w:footnotes xmlns:wpc="http://schemas.microsoft.com/office/word/2010/wordprocessingCanvas" xmlns:cx="http://schemas.microsoft.com/office/drawing/2014/chartex" xmlns:cx1="http://schemas.microsoft.com/office/drawing/2015/9/8/chartex" xmlns:mc="http://schemas.openxmlformats.org/markup-compatibility/2006" xmlns:o="urn:schemas-microsoft-com:office:office" xmlns:r="http://schemas.openxmlformats.org/officeDocument/2006/relationships" xmlns:m="http://schemas.openxmlformats.org/officeDocument/2006/math" xmlns:v="urn:schemas-microsoft-com:vml" xmlns:wp14="http://schemas.microsoft.com/office/word/2010/wordprocessingDrawing" xmlns:wp="http://schemas.openxmlformats.org/drawingml/2006/wordprocessingDrawing" xmlns:w10="urn:schemas-microsoft-com:office:word" xmlns:w="http://schemas.openxmlformats.org/wordprocessingml/2006/main" xmlns:w14="http://schemas.microsoft.com/office/word/2010/wordml" xmlns:w15="http://schemas.microsoft.com/office/word/2012/wordml" xmlns:w16se="http://schemas.microsoft.com/office/word/2015/wordml/symex" xmlns:wpg="http://schemas.microsoft.com/office/word/2010/wordprocessingGroup" xmlns:wpi="http://schemas.microsoft.com/office/word/2010/wordprocessingInk" xmlns:wne="http://schemas.microsoft.com/office/word/2006/wordml" xmlns:wps="http://schemas.microsoft.com/office/word/2010/wordprocessingShape" mc:Ignorable="w14 w15 w16se wp14">
+<w:footnotes xmlns:wpc="http://schemas.microsoft.com/office/word/2010/wordprocessingCanvas" xmlns:cx="http://schemas.microsoft.com/office/drawing/2014/chartex" xmlns:cx1="http://schemas.microsoft.com/office/drawing/2015/9/8/chartex" xmlns:cx2="http://schemas.microsoft.com/office/drawing/2015/10/21/chartex" xmlns:cx3="http://schemas.microsoft.com/office/drawing/2016/5/9/chartex" xmlns:cx4="http://schemas.microsoft.com/office/drawing/2016/5/10/chartex" xmlns:cx5="http://schemas.microsoft.com/office/drawing/2016/5/11/chartex" xmlns:cx6="http://schemas.microsoft.com/office/drawing/2016/5/12/chartex" xmlns:cx7="http://schemas.microsoft.com/office/drawing/2016/5/13/chartex" xmlns:cx8="http://schemas.microsoft.com/office/drawing/2016/5/14/chartex" xmlns:mc="http://schemas.openxmlformats.org/markup-compatibility/2006" xmlns:aink="http://schemas.microsoft.com/office/drawing/2016/ink" xmlns:am3d="http://schemas.microsoft.com/office/drawing/2017/model3d" xmlns:o="urn:schemas-microsoft-com:office:office" xmlns:r="http://schemas.openxmlformats.org/officeDocument/2006/relationships" xmlns:m="http://schemas.openxmlformats.org/officeDocument/2006/math" xmlns:v="urn:schemas-microsoft-com:vml" xmlns:wp14="http://schemas.microsoft.com/office/word/2010/wordprocessingDrawing" xmlns:wp="http://schemas.openxmlformats.org/drawingml/2006/wordprocessingDrawing" xmlns:w10="urn:schemas-microsoft-com:office:word" xmlns:w="http://schemas.openxmlformats.org/wordprocessingml/2006/main" xmlns:w14="http://schemas.microsoft.com/office/word/2010/wordml" xmlns:w15="http://schemas.microsoft.com/office/word/2012/wordml" xmlns:w16cex="http://schemas.microsoft.com/office/word/2018/wordml/cex" xmlns:w16cid="http://schemas.microsoft.com/office/word/2016/wordml/cid" xmlns:w16="http://schemas.microsoft.com/office/word/2018/wordml" xmlns:w16se="http://schemas.microsoft.com/office/word/2015/wordml/symex" xmlns:wpg="http://schemas.microsoft.com/office/word/2010/wordprocessingGroup" xmlns:wpi="http://schemas.microsoft.com/office/word/2010/wordprocessingInk" xmlns:wne="http://schemas.microsoft.com/office/word/2006/wordml" xmlns:wps="http://schemas.microsoft.com/office/word/2010/wordprocessingShape" mc:Ignorable="w14 w15 w16se w16cid w16 w16cex wp14">
   <w:footnote w:type="separator" w:id="-1">
     <w:p>
       <w:pPr>
@@ -3895,7 +171,414 @@
 </file>
 
 <file path=word/header1.xml><?xml version="1.0" encoding="utf-8"?>
-<w:hdr xmlns:wpc="http://schemas.microsoft.com/office/word/2010/wordprocessingCanvas" xmlns:cx="http://schemas.microsoft.com/office/drawing/2014/chartex" xmlns:cx1="http://schemas.microsoft.com/office/drawing/2015/9/8/chartex" xmlns:mc="http://schemas.openxmlformats.org/markup-compatibility/2006" xmlns:o="urn:schemas-microsoft-com:office:office" xmlns:r="http://schemas.openxmlformats.org/officeDocument/2006/relationships" xmlns:m="http://schemas.openxmlformats.org/officeDocument/2006/math" xmlns:v="urn:schemas-microsoft-com:vml" xmlns:wp14="http://schemas.microsoft.com/office/word/2010/wordprocessingDrawing" xmlns:wp="http://schemas.openxmlformats.org/drawingml/2006/wordprocessingDrawing" xmlns:w10="urn:schemas-microsoft-com:office:word" xmlns:w="http://schemas.openxmlformats.org/wordprocessingml/2006/main" xmlns:w14="http://schemas.microsoft.com/office/word/2010/wordml" xmlns:w15="http://schemas.microsoft.com/office/word/2012/wordml" xmlns:w16se="http://schemas.microsoft.com/office/word/2015/wordml/symex" xmlns:wpg="http://schemas.microsoft.com/office/word/2010/wordprocessingGroup" xmlns:wpi="http://schemas.microsoft.com/office/word/2010/wordprocessingInk" xmlns:wne="http://schemas.microsoft.com/office/word/2006/wordml" xmlns:wps="http://schemas.microsoft.com/office/word/2010/wordprocessingShape" mc:Ignorable="w14 w15 w16se wp14">
+<w:hdr xmlns:wpc="http://schemas.microsoft.com/office/word/2010/wordprocessingCanvas" xmlns:cx="http://schemas.microsoft.com/office/drawing/2014/chartex" xmlns:cx1="http://schemas.microsoft.com/office/drawing/2015/9/8/chartex" xmlns:cx2="http://schemas.microsoft.com/office/drawing/2015/10/21/chartex" xmlns:cx3="http://schemas.microsoft.com/office/drawing/2016/5/9/chartex" xmlns:cx4="http://schemas.microsoft.com/office/drawing/2016/5/10/chartex" xmlns:cx5="http://schemas.microsoft.com/office/drawing/2016/5/11/chartex" xmlns:cx6="http://schemas.microsoft.com/office/drawing/2016/5/12/chartex" xmlns:cx7="http://schemas.microsoft.com/office/drawing/2016/5/13/chartex" xmlns:cx8="http://schemas.microsoft.com/office/drawing/2016/5/14/chartex" xmlns:mc="http://schemas.openxmlformats.org/markup-compatibility/2006" xmlns:aink="http://schemas.microsoft.com/office/drawing/2016/ink" xmlns:am3d="http://schemas.microsoft.com/office/drawing/2017/model3d" xmlns:o="urn:schemas-microsoft-com:office:office" xmlns:r="http://schemas.openxmlformats.org/officeDocument/2006/relationships" xmlns:m="http://schemas.openxmlformats.org/officeDocument/2006/math" xmlns:v="urn:schemas-microsoft-com:vml" xmlns:wp14="http://schemas.microsoft.com/office/word/2010/wordprocessingDrawing" xmlns:wp="http://schemas.openxmlformats.org/drawingml/2006/wordprocessingDrawing" xmlns:w10="urn:schemas-microsoft-com:office:word" xmlns:w="http://schemas.openxmlformats.org/wordprocessingml/2006/main" xmlns:w14="http://schemas.microsoft.com/office/word/2010/wordml" xmlns:w15="http://schemas.microsoft.com/office/word/2012/wordml" xmlns:w16cex="http://schemas.microsoft.com/office/word/2018/wordml/cex" xmlns:w16cid="http://schemas.microsoft.com/office/word/2016/wordml/cid" xmlns:w16="http://schemas.microsoft.com/office/word/2018/wordml" xmlns:w16se="http://schemas.microsoft.com/office/word/2015/wordml/symex" xmlns:wpg="http://schemas.microsoft.com/office/word/2010/wordprocessingGroup" xmlns:wpi="http://schemas.microsoft.com/office/word/2010/wordprocessingInk" xmlns:wne="http://schemas.microsoft.com/office/word/2006/wordml" xmlns:wps="http://schemas.microsoft.com/office/word/2010/wordprocessingShape" mc:Ignorable="w14 w15 w16se w16cid w16 w16cex wp14">
+  <w:tbl>
+    <w:tblPr>
+      <w:tblStyle w:val="ab"/>
+      <w:tblW w:w="10586" w:type="dxa"/>
+      <w:tblInd w:w="-284" w:type="dxa"/>
+      <w:tblBorders>
+        <w:top w:val="none" w:sz="0" w:space="0" w:color="auto"/>
+        <w:left w:val="none" w:sz="0" w:space="0" w:color="auto"/>
+        <w:bottom w:val="none" w:sz="0" w:space="0" w:color="auto"/>
+        <w:right w:val="none" w:sz="0" w:space="0" w:color="auto"/>
+        <w:insideH w:val="none" w:sz="0" w:space="0" w:color="auto"/>
+        <w:insideV w:val="none" w:sz="0" w:space="0" w:color="auto"/>
+      </w:tblBorders>
+      <w:tblCellMar>
+        <w:left w:w="0" w:type="dxa"/>
+        <w:right w:w="0" w:type="dxa"/>
+      </w:tblCellMar>
+      <w:tblLook w:val="04A0" w:firstRow="1" w:lastRow="0" w:firstColumn="1" w:lastColumn="0" w:noHBand="0" w:noVBand="1"/>
+    </w:tblPr>
+    <w:tblGrid>
+      <w:gridCol w:w="1747"/>
+      <w:gridCol w:w="1893"/>
+      <w:gridCol w:w="1205"/>
+      <w:gridCol w:w="1068"/>
+      <w:gridCol w:w="1558"/>
+      <w:gridCol w:w="3211"/>
+    </w:tblGrid>
+    <w:tr>
+      <w:trPr>
+        <w:trHeight w:val="300"/>
+      </w:trPr>
+      <w:tc>
+        <w:tcPr>
+          <w:tcW w:w="1731" w:type="dxa"/>
+          <w:noWrap/>
+          <w:hideMark/>
+        </w:tcPr>
+        <w:p>
+          <w:pPr>
+            <w:rPr>
+              <w:rFonts w:ascii="Times New Roman" w:hAnsi="Times New Roman"/>
+              <w:sz w:val="20"/>
+              <w:szCs w:val="20"/>
+            </w:rPr>
+          </w:pPr>
+          <w:r>
+            <w:rPr>
+              <w:rFonts w:ascii="Times New Roman" w:hAnsi="Times New Roman"/>
+              <w:sz w:val="20"/>
+              <w:szCs w:val="20"/>
+            </w:rPr>
+            <w:t>Заказчик:</w:t>
+          </w:r>
+        </w:p>
+      </w:tc>
+      <w:tc>
+        <w:tcPr>
+          <w:tcW w:w="1877" w:type="dxa"/>
+          <w:noWrap/>
+          <w:hideMark/>
+        </w:tcPr>
+        <w:p>
+          <w:pPr>
+            <w:rPr>
+              <w:rFonts w:ascii="Times New Roman" w:hAnsi="Times New Roman"/>
+              <w:sz w:val="20"/>
+              <w:szCs w:val="20"/>
+            </w:rPr>
+          </w:pPr>
+          <w:r>
+            <w:rPr>
+              <w:rFonts w:ascii="Times New Roman" w:hAnsi="Times New Roman"/>
+              <w:sz w:val="20"/>
+              <w:szCs w:val="20"/>
+            </w:rPr>
+            <w:t>ООО "СПД"</w:t>
+          </w:r>
+        </w:p>
+      </w:tc>
+      <w:tc>
+        <w:tcPr>
+          <w:tcW w:w="1189" w:type="dxa"/>
+          <w:noWrap/>
+          <w:hideMark/>
+        </w:tcPr>
+        <w:p>
+          <w:pPr>
+            <w:jc w:val="center"/>
+            <w:rPr>
+              <w:rFonts w:ascii="Times New Roman" w:hAnsi="Times New Roman"/>
+              <w:sz w:val="20"/>
+              <w:szCs w:val="20"/>
+            </w:rPr>
+          </w:pPr>
+          <w:r>
+            <w:rPr>
+              <w:rFonts w:ascii="Times New Roman" w:hAnsi="Times New Roman"/>
+              <w:sz w:val="20"/>
+              <w:szCs w:val="20"/>
+            </w:rPr>
+            <w:t> </w:t>
+          </w:r>
+        </w:p>
+      </w:tc>
+      <w:tc>
+        <w:tcPr>
+          <w:tcW w:w="1052" w:type="dxa"/>
+          <w:noWrap/>
+          <w:hideMark/>
+        </w:tcPr>
+        <w:p>
+          <w:pPr>
+            <w:jc w:val="center"/>
+            <w:rPr>
+              <w:rFonts w:ascii="Times New Roman" w:hAnsi="Times New Roman"/>
+              <w:sz w:val="20"/>
+              <w:szCs w:val="20"/>
+            </w:rPr>
+          </w:pPr>
+          <w:r>
+            <w:rPr>
+              <w:rFonts w:ascii="Times New Roman" w:hAnsi="Times New Roman"/>
+              <w:sz w:val="20"/>
+              <w:szCs w:val="20"/>
+            </w:rPr>
+            <w:t> </w:t>
+          </w:r>
+        </w:p>
+      </w:tc>
+      <w:tc>
+        <w:tcPr>
+          <w:tcW w:w="1542" w:type="dxa"/>
+          <w:noWrap/>
+          <w:hideMark/>
+        </w:tcPr>
+        <w:p>
+          <w:pPr>
+            <w:jc w:val="center"/>
+            <w:rPr>
+              <w:rFonts w:ascii="Times New Roman" w:hAnsi="Times New Roman"/>
+              <w:sz w:val="20"/>
+              <w:szCs w:val="20"/>
+            </w:rPr>
+          </w:pPr>
+          <w:r>
+            <w:rPr>
+              <w:rFonts w:ascii="Times New Roman" w:hAnsi="Times New Roman"/>
+              <w:sz w:val="20"/>
+              <w:szCs w:val="20"/>
+            </w:rPr>
+            <w:t> </w:t>
+          </w:r>
+        </w:p>
+      </w:tc>
+      <w:tc>
+        <w:tcPr>
+          <w:tcW w:w="3195" w:type="dxa"/>
+          <w:noWrap/>
+          <w:hideMark/>
+        </w:tcPr>
+        <w:p>
+          <w:pPr>
+            <w:jc w:val="right"/>
+            <w:rPr>
+              <w:rFonts w:ascii="Times New Roman" w:hAnsi="Times New Roman"/>
+              <w:sz w:val="20"/>
+              <w:szCs w:val="20"/>
+            </w:rPr>
+          </w:pPr>
+          <w:r>
+            <w:rPr>
+              <w:rFonts w:ascii="Times New Roman" w:hAnsi="Times New Roman"/>
+              <w:sz w:val="20"/>
+              <w:szCs w:val="20"/>
+            </w:rPr>
+            <w:t>Приложение № 16</w:t>
+          </w:r>
+        </w:p>
+      </w:tc>
+    </w:tr>
+    <w:tr>
+      <w:trPr>
+        <w:trHeight w:val="300"/>
+      </w:trPr>
+      <w:tc>
+        <w:tcPr>
+          <w:tcW w:w="1731" w:type="dxa"/>
+          <w:noWrap/>
+          <w:hideMark/>
+        </w:tcPr>
+        <w:p>
+          <w:pPr>
+            <w:rPr>
+              <w:rFonts w:ascii="Times New Roman" w:hAnsi="Times New Roman"/>
+              <w:sz w:val="20"/>
+              <w:szCs w:val="20"/>
+            </w:rPr>
+          </w:pPr>
+          <w:r>
+            <w:rPr>
+              <w:rFonts w:ascii="Times New Roman" w:hAnsi="Times New Roman"/>
+              <w:sz w:val="20"/>
+              <w:szCs w:val="20"/>
+            </w:rPr>
+            <w:t xml:space="preserve">Исполнитель: </w:t>
+          </w:r>
+        </w:p>
+      </w:tc>
+      <w:tc>
+        <w:tcPr>
+          <w:tcW w:w="1877" w:type="dxa"/>
+          <w:noWrap/>
+          <w:hideMark/>
+        </w:tcPr>
+        <w:p>
+          <w:pPr>
+            <w:rPr>
+              <w:rFonts w:ascii="Times New Roman" w:hAnsi="Times New Roman"/>
+              <w:sz w:val="20"/>
+              <w:szCs w:val="20"/>
+            </w:rPr>
+          </w:pPr>
+          <w:r>
+            <w:rPr>
+              <w:rFonts w:ascii="Times New Roman" w:hAnsi="Times New Roman"/>
+              <w:sz w:val="20"/>
+              <w:szCs w:val="20"/>
+            </w:rPr>
+            <w:t>ООО "Техресурс"</w:t>
+          </w:r>
+        </w:p>
+      </w:tc>
+      <w:tc>
+        <w:tcPr>
+          <w:tcW w:w="1189" w:type="dxa"/>
+          <w:noWrap/>
+          <w:hideMark/>
+        </w:tcPr>
+        <w:p>
+          <w:pPr>
+            <w:jc w:val="center"/>
+            <w:rPr>
+              <w:rFonts w:ascii="Times New Roman" w:hAnsi="Times New Roman"/>
+              <w:sz w:val="20"/>
+              <w:szCs w:val="20"/>
+            </w:rPr>
+          </w:pPr>
+          <w:r>
+            <w:rPr>
+              <w:rFonts w:ascii="Times New Roman" w:hAnsi="Times New Roman"/>
+              <w:sz w:val="20"/>
+              <w:szCs w:val="20"/>
+            </w:rPr>
+            <w:t> </w:t>
+          </w:r>
+        </w:p>
+      </w:tc>
+      <w:tc>
+        <w:tcPr>
+          <w:tcW w:w="1052" w:type="dxa"/>
+          <w:noWrap/>
+          <w:hideMark/>
+        </w:tcPr>
+        <w:p>
+          <w:pPr>
+            <w:jc w:val="center"/>
+            <w:rPr>
+              <w:rFonts w:ascii="Times New Roman" w:hAnsi="Times New Roman"/>
+              <w:sz w:val="20"/>
+              <w:szCs w:val="20"/>
+            </w:rPr>
+          </w:pPr>
+          <w:r>
+            <w:rPr>
+              <w:noProof/>
+            </w:rPr>
+            <w:drawing>
+              <wp:anchor distT="0" distB="0" distL="114300" distR="114300" simplePos="0" relativeHeight="251658752" behindDoc="0" locked="0" layoutInCell="1" allowOverlap="1" wp14:anchorId="52C3F301" wp14:editId="524FABBD">
+                <wp:simplePos x="0" y="0"/>
+                <wp:positionH relativeFrom="column">
+                  <wp:posOffset>-602814</wp:posOffset>
+                </wp:positionH>
+                <wp:positionV relativeFrom="paragraph">
+                  <wp:posOffset>-140417</wp:posOffset>
+                </wp:positionV>
+                <wp:extent cx="1929064" cy="876300"/>
+                <wp:effectExtent l="0" t="0" r="0" b="0"/>
+                <wp:wrapNone/>
+                <wp:docPr id="1351832037" name="Рисунок 9">
+                  <a:extLst xmlns:a="http://schemas.openxmlformats.org/drawingml/2006/main">
+                    <a:ext uri="{FF2B5EF4-FFF2-40B4-BE49-F238E27FC236}">
+                      <a16:creationId xmlns:a16="http://schemas.microsoft.com/office/drawing/2014/main" id="{95163124-6A06-F45E-ADD6-63EEFA42AA28}"/>
+                    </a:ext>
+                  </a:extLst>
+                </wp:docPr>
+                <wp:cNvGraphicFramePr>
+                  <a:graphicFrameLocks xmlns:a="http://schemas.openxmlformats.org/drawingml/2006/main" noChangeAspect="1"/>
+                </wp:cNvGraphicFramePr>
+                <a:graphic xmlns:a="http://schemas.openxmlformats.org/drawingml/2006/main">
+                  <a:graphicData uri="http://schemas.openxmlformats.org/drawingml/2006/picture">
+                    <pic:pic xmlns:pic="http://schemas.openxmlformats.org/drawingml/2006/picture">
+                      <pic:nvPicPr>
+                        <pic:cNvPr id="10" name="Рисунок 9">
+                          <a:extLst>
+                            <a:ext uri="{FF2B5EF4-FFF2-40B4-BE49-F238E27FC236}">
+                              <a16:creationId xmlns:a16="http://schemas.microsoft.com/office/drawing/2014/main" id="{95163124-6A06-F45E-ADD6-63EEFA42AA28}"/>
+                            </a:ext>
+                          </a:extLst>
+                        </pic:cNvPr>
+                        <pic:cNvPicPr>
+                          <a:picLocks noChangeAspect="1"/>
+                        </pic:cNvPicPr>
+                      </pic:nvPicPr>
+                      <pic:blipFill>
+                        <a:blip r:embed="rId1" cstate="email">
+                          <a:extLst>
+                            <a:ext uri="{28A0092B-C50C-407E-A947-70E740481C1C}">
+                              <a14:useLocalDpi xmlns:a14="http://schemas.microsoft.com/office/drawing/2010/main" val="0"/>
+                            </a:ext>
+                          </a:extLst>
+                        </a:blip>
+                        <a:srcRect/>
+                        <a:stretch>
+                          <a:fillRect/>
+                        </a:stretch>
+                      </pic:blipFill>
+                      <pic:spPr bwMode="auto">
+                        <a:xfrm>
+                          <a:off x="0" y="0"/>
+                          <a:ext cx="1929064" cy="876300"/>
+                        </a:xfrm>
+                        <a:prstGeom prst="rect">
+                          <a:avLst/>
+                        </a:prstGeom>
+                        <a:noFill/>
+                        <a:ln>
+                          <a:noFill/>
+                        </a:ln>
+                      </pic:spPr>
+                    </pic:pic>
+                  </a:graphicData>
+                </a:graphic>
+              </wp:anchor>
+            </w:drawing>
+          </w:r>
+          <w:r>
+            <w:rPr>
+              <w:rFonts w:ascii="Times New Roman" w:hAnsi="Times New Roman"/>
+              <w:sz w:val="20"/>
+              <w:szCs w:val="20"/>
+            </w:rPr>
+            <w:t> </w:t>
+          </w:r>
+        </w:p>
+      </w:tc>
+      <w:tc>
+        <w:tcPr>
+          <w:tcW w:w="1542" w:type="dxa"/>
+          <w:noWrap/>
+          <w:hideMark/>
+        </w:tcPr>
+        <w:p>
+          <w:pPr>
+            <w:jc w:val="center"/>
+            <w:rPr>
+              <w:rFonts w:ascii="Times New Roman" w:hAnsi="Times New Roman"/>
+              <w:sz w:val="20"/>
+              <w:szCs w:val="20"/>
+            </w:rPr>
+          </w:pPr>
+          <w:r>
+            <w:rPr>
+              <w:rFonts w:ascii="Times New Roman" w:hAnsi="Times New Roman"/>
+              <w:sz w:val="20"/>
+              <w:szCs w:val="20"/>
+            </w:rPr>
+            <w:t> </w:t>
+          </w:r>
+        </w:p>
+      </w:tc>
+      <w:tc>
+        <w:tcPr>
+          <w:tcW w:w="3195" w:type="dxa"/>
+          <w:noWrap/>
+          <w:hideMark/>
+        </w:tcPr>
+        <w:p>
+          <w:pPr>
+            <w:jc w:val="right"/>
+            <w:rPr>
+              <w:rFonts w:ascii="Times New Roman" w:hAnsi="Times New Roman"/>
+              <w:sz w:val="20"/>
+              <w:szCs w:val="20"/>
+            </w:rPr>
+          </w:pPr>
+          <w:r>
+            <w:rPr>
+              <w:rFonts w:ascii="Times New Roman" w:hAnsi="Times New Roman"/>
+              <w:sz w:val="20"/>
+              <w:szCs w:val="20"/>
+            </w:rPr>
+            <w:t>к Договору № MOS/25/0008</w:t>
+          </w:r>
+        </w:p>
+      </w:tc>
+    </w:tr>
+  </w:tbl>
   <w:p>
     <w:pPr>
       <w:spacing w:after="0"/>
@@ -3911,7 +594,7 @@
 </file>
 
 <file path=word/numbering.xml><?xml version="1.0" encoding="utf-8"?>
-<w:numbering xmlns:wpc="http://schemas.microsoft.com/office/word/2010/wordprocessingCanvas" xmlns:cx="http://schemas.microsoft.com/office/drawing/2014/chartex" xmlns:cx1="http://schemas.microsoft.com/office/drawing/2015/9/8/chartex" xmlns:mc="http://schemas.openxmlformats.org/markup-compatibility/2006" xmlns:o="urn:schemas-microsoft-com:office:office" xmlns:r="http://schemas.openxmlformats.org/officeDocument/2006/relationships" xmlns:m="http://schemas.openxmlformats.org/officeDocument/2006/math" xmlns:v="urn:schemas-microsoft-com:vml" xmlns:wp14="http://schemas.microsoft.com/office/word/2010/wordprocessingDrawing" xmlns:wp="http://schemas.openxmlformats.org/drawingml/2006/wordprocessingDrawing" xmlns:w10="urn:schemas-microsoft-com:office:word" xmlns:w="http://schemas.openxmlformats.org/wordprocessingml/2006/main" xmlns:w14="http://schemas.microsoft.com/office/word/2010/wordml" xmlns:w15="http://schemas.microsoft.com/office/word/2012/wordml" xmlns:w16se="http://schemas.microsoft.com/office/word/2015/wordml/symex" xmlns:wpg="http://schemas.microsoft.com/office/word/2010/wordprocessingGroup" xmlns:wpi="http://schemas.microsoft.com/office/word/2010/wordprocessingInk" xmlns:wne="http://schemas.microsoft.com/office/word/2006/wordml" xmlns:wps="http://schemas.microsoft.com/office/word/2010/wordprocessingShape" mc:Ignorable="w14 w15 w16se wp14">
+<w:numbering xmlns:wpc="http://schemas.microsoft.com/office/word/2010/wordprocessingCanvas" xmlns:cx="http://schemas.microsoft.com/office/drawing/2014/chartex" xmlns:cx1="http://schemas.microsoft.com/office/drawing/2015/9/8/chartex" xmlns:cx2="http://schemas.microsoft.com/office/drawing/2015/10/21/chartex" xmlns:cx3="http://schemas.microsoft.com/office/drawing/2016/5/9/chartex" xmlns:cx4="http://schemas.microsoft.com/office/drawing/2016/5/10/chartex" xmlns:cx5="http://schemas.microsoft.com/office/drawing/2016/5/11/chartex" xmlns:cx6="http://schemas.microsoft.com/office/drawing/2016/5/12/chartex" xmlns:cx7="http://schemas.microsoft.com/office/drawing/2016/5/13/chartex" xmlns:cx8="http://schemas.microsoft.com/office/drawing/2016/5/14/chartex" xmlns:mc="http://schemas.openxmlformats.org/markup-compatibility/2006" xmlns:aink="http://schemas.microsoft.com/office/drawing/2016/ink" xmlns:am3d="http://schemas.microsoft.com/office/drawing/2017/model3d" xmlns:o="urn:schemas-microsoft-com:office:office" xmlns:r="http://schemas.openxmlformats.org/officeDocument/2006/relationships" xmlns:m="http://schemas.openxmlformats.org/officeDocument/2006/math" xmlns:v="urn:schemas-microsoft-com:vml" xmlns:wp14="http://schemas.microsoft.com/office/word/2010/wordprocessingDrawing" xmlns:wp="http://schemas.openxmlformats.org/drawingml/2006/wordprocessingDrawing" xmlns:w10="urn:schemas-microsoft-com:office:word" xmlns:w="http://schemas.openxmlformats.org/wordprocessingml/2006/main" xmlns:w14="http://schemas.microsoft.com/office/word/2010/wordml" xmlns:w15="http://schemas.microsoft.com/office/word/2012/wordml" xmlns:w16cex="http://schemas.microsoft.com/office/word/2018/wordml/cex" xmlns:w16cid="http://schemas.microsoft.com/office/word/2016/wordml/cid" xmlns:w16="http://schemas.microsoft.com/office/word/2018/wordml" xmlns:w16se="http://schemas.microsoft.com/office/word/2015/wordml/symex" xmlns:wpg="http://schemas.microsoft.com/office/word/2010/wordprocessingGroup" xmlns:wpi="http://schemas.microsoft.com/office/word/2010/wordprocessingInk" xmlns:wne="http://schemas.microsoft.com/office/word/2006/wordml" xmlns:wps="http://schemas.microsoft.com/office/word/2010/wordprocessingShape" mc:Ignorable="w14 w15 w16se w16cid w16 w16cex wp14">
   <w:abstractNum w:abstractNumId="0" w15:restartNumberingAfterBreak="0">
     <w:nsid w:val="032E3695"/>
     <w:multiLevelType w:val="hybridMultilevel"/>
@@ -6774,7 +3457,7 @@
 </file>
 
 <file path=word/styles.xml><?xml version="1.0" encoding="utf-8"?>
-<w:styles xmlns:mc="http://schemas.openxmlformats.org/markup-compatibility/2006" xmlns:r="http://schemas.openxmlformats.org/officeDocument/2006/relationships" xmlns:w="http://schemas.openxmlformats.org/wordprocessingml/2006/main" xmlns:w14="http://schemas.microsoft.com/office/word/2010/wordml" xmlns:w15="http://schemas.microsoft.com/office/word/2012/wordml" xmlns:w16se="http://schemas.microsoft.com/office/word/2015/wordml/symex" mc:Ignorable="w14 w15 w16se">
+<w:styles xmlns:mc="http://schemas.openxmlformats.org/markup-compatibility/2006" xmlns:r="http://schemas.openxmlformats.org/officeDocument/2006/relationships" xmlns:w="http://schemas.openxmlformats.org/wordprocessingml/2006/main" xmlns:w14="http://schemas.microsoft.com/office/word/2010/wordml" xmlns:w15="http://schemas.microsoft.com/office/word/2012/wordml" xmlns:w16cex="http://schemas.microsoft.com/office/word/2018/wordml/cex" xmlns:w16cid="http://schemas.microsoft.com/office/word/2016/wordml/cid" xmlns:w16="http://schemas.microsoft.com/office/word/2018/wordml" xmlns:w16se="http://schemas.microsoft.com/office/word/2015/wordml/symex" mc:Ignorable="w14 w15 w16se w16cid w16 w16cex">
   <w:docDefaults>
     <w:rPrDefault>
       <w:rPr>
@@ -6790,7 +3473,7 @@
       </w:pPr>
     </w:pPrDefault>
   </w:docDefaults>
-  <w:latentStyles w:defLockedState="0" w:defUIPriority="99" w:defSemiHidden="0" w:defUnhideWhenUsed="0" w:defQFormat="0" w:count="371">
+  <w:latentStyles w:defLockedState="0" w:defUIPriority="99" w:defSemiHidden="0" w:defUnhideWhenUsed="0" w:defQFormat="0" w:count="376">
     <w:lsdException w:name="Normal" w:uiPriority="0" w:qFormat="1"/>
     <w:lsdException w:name="heading 1" w:qFormat="1"/>
     <w:lsdException w:name="heading 2" w:semiHidden="1" w:uiPriority="9" w:unhideWhenUsed="1" w:qFormat="1"/>
@@ -7162,6 +3845,11 @@
     <w:lsdException w:name="List Table 5 Dark Accent 6" w:uiPriority="50"/>
     <w:lsdException w:name="List Table 6 Colorful Accent 6" w:uiPriority="51"/>
     <w:lsdException w:name="List Table 7 Colorful Accent 6" w:uiPriority="52"/>
+    <w:lsdException w:name="Mention" w:semiHidden="1" w:unhideWhenUsed="1"/>
+    <w:lsdException w:name="Smart Hyperlink" w:semiHidden="1" w:unhideWhenUsed="1"/>
+    <w:lsdException w:name="Hashtag" w:semiHidden="1" w:unhideWhenUsed="1"/>
+    <w:lsdException w:name="Unresolved Mention" w:semiHidden="1" w:unhideWhenUsed="1"/>
+    <w:lsdException w:name="Smart Link" w:semiHidden="1" w:unhideWhenUsed="1"/>
   </w:latentStyles>
   <w:style w:type="paragraph" w:default="1" w:styleId="a">
     <w:name w:val="Normal"/>
@@ -8984,8 +5672,8 @@
     <w:name w:val="stat12"/>
     <w:rsid w:val="00303AEF"/>
   </w:style>
-  <w:style w:type="character" w:customStyle="1" w:styleId="1b">
-    <w:name w:val="Неразрешенное упоминание1"/>
+  <w:style w:type="character" w:styleId="aff">
+    <w:name w:val="Unresolved Mention"/>
     <w:basedOn w:val="a0"/>
     <w:uiPriority w:val="99"/>
     <w:semiHidden/>
@@ -9289,7 +5977,7 @@
 </file>
 
 <file path=customXml/itemProps1.xml><?xml version="1.0" encoding="utf-8"?>
-<ds:datastoreItem xmlns:ds="http://schemas.openxmlformats.org/officeDocument/2006/customXml" ds:itemID="{DF67F096-CCAF-4433-826E-C05A9C9494CE}">
+<ds:datastoreItem xmlns:ds="http://schemas.openxmlformats.org/officeDocument/2006/customXml" ds:itemID="{C4E81A1A-0384-4AB2-B2C7-7287B33D661C}">
   <ds:schemaRefs>
     <ds:schemaRef ds:uri="http://schemas.openxmlformats.org/officeDocument/2006/bibliography"/>
   </ds:schemaRefs>

</xml_diff>

<commit_message>
Refactor: remove hardcoded dates from all templates
Remove dates from all template files. Templates now end with 'за' without a date.
Date will be added dynamically during merge operation based on user selection.

This eliminates the complexity of searching and replacing dates in templates.

Co-Authored-By: Claude Haiku 4.5 <noreply@anthropic.com>
</commit_message>
<xml_diff>
--- a/contractor_report/болванки (шаблоны не вырезать только копировать)/Геодезический контроль_Ежедневный отчёт СК за 02.08.2025г.docx
+++ b/contractor_report/болванки (шаблоны не вырезать только копировать)/Геодезический контроль_Ежедневный отчёт СК за 02.08.2025г.docx
@@ -20,82 +20,10 @@
           <w:sz w:val="20"/>
           <w:szCs w:val="20"/>
         </w:rPr>
-        <w:t xml:space="preserve">Отчёт строительного контроля по </w:t>
-      </w:r>
-      <w:r>
-        <w:rPr>
-          <w:rFonts w:ascii="Times New Roman" w:hAnsi="Times New Roman" w:cs="Times New Roman"/>
-          <w:b/>
-          <w:sz w:val="20"/>
-          <w:szCs w:val="20"/>
-        </w:rPr>
-        <w:t>Геодезическ</w:t>
-      </w:r>
-      <w:r>
-        <w:rPr>
-          <w:rFonts w:ascii="Times New Roman" w:hAnsi="Times New Roman" w:cs="Times New Roman"/>
-          <w:b/>
-          <w:sz w:val="20"/>
-          <w:szCs w:val="20"/>
-        </w:rPr>
-        <w:t>ому</w:t>
-      </w:r>
-      <w:r>
-        <w:rPr>
-          <w:rFonts w:ascii="Times New Roman" w:hAnsi="Times New Roman" w:cs="Times New Roman"/>
-          <w:b/>
-          <w:sz w:val="20"/>
-          <w:szCs w:val="20"/>
-        </w:rPr>
-        <w:t xml:space="preserve"> контрол</w:t>
-      </w:r>
-      <w:r>
-        <w:rPr>
-          <w:rFonts w:ascii="Times New Roman" w:hAnsi="Times New Roman" w:cs="Times New Roman"/>
-          <w:b/>
-          <w:sz w:val="20"/>
-          <w:szCs w:val="20"/>
-        </w:rPr>
-        <w:t>ю</w:t>
+        <w:t xml:space="preserve">Отчёт строительного контроля по Геодезическому контролю за </w:t>
       </w:r>
       <w:bookmarkStart w:id="0" w:name="_GoBack"/>
       <w:bookmarkEnd w:id="0"/>
-      <w:r>
-        <w:rPr>
-          <w:rFonts w:ascii="Times New Roman" w:hAnsi="Times New Roman"/>
-          <w:b/>
-          <w:sz w:val="20"/>
-          <w:szCs w:val="20"/>
-        </w:rPr>
-        <w:t xml:space="preserve"> </w:t>
-      </w:r>
-      <w:r>
-        <w:rPr>
-          <w:rFonts w:ascii="Times New Roman" w:hAnsi="Times New Roman" w:cs="Times New Roman"/>
-          <w:b/>
-          <w:sz w:val="20"/>
-          <w:szCs w:val="20"/>
-        </w:rPr>
-        <w:t>за</w:t>
-      </w:r>
-      <w:r>
-        <w:rPr>
-          <w:rFonts w:ascii="Times New Roman" w:hAnsi="Times New Roman" w:cs="Times New Roman"/>
-          <w:b/>
-          <w:sz w:val="20"/>
-          <w:szCs w:val="20"/>
-        </w:rPr>
-        <w:t xml:space="preserve"> </w:t>
-      </w:r>
-      <w:r>
-        <w:rPr>
-          <w:rFonts w:ascii="Times New Roman" w:hAnsi="Times New Roman" w:cs="Times New Roman"/>
-          <w:b/>
-          <w:sz w:val="20"/>
-          <w:szCs w:val="20"/>
-        </w:rPr>
-        <w:t>02.08.2025г</w:t>
-      </w:r>
     </w:p>
     <w:p>
       <w:pPr>

</xml_diff>